<commit_message>
To Set Multiple TT in TT Form as Professional
</commit_message>
<xml_diff>
--- a/document/create_tt.docx
+++ b/document/create_tt.docx
@@ -3,7 +3,7 @@
 <w:document xmlns:wpc="http://schemas.microsoft.com/office/word/2010/wordprocessingCanvas" xmlns:cx="http://schemas.microsoft.com/office/drawing/2014/chartex" xmlns:cx1="http://schemas.microsoft.com/office/drawing/2015/9/8/chartex" xmlns:cx2="http://schemas.microsoft.com/office/drawing/2015/10/21/chartex" xmlns:cx3="http://schemas.microsoft.com/office/drawing/2016/5/9/chartex" xmlns:cx4="http://schemas.microsoft.com/office/drawing/2016/5/10/chartex" xmlns:cx5="http://schemas.microsoft.com/office/drawing/2016/5/11/chartex" xmlns:cx6="http://schemas.microsoft.com/office/drawing/2016/5/12/chartex" xmlns:cx7="http://schemas.microsoft.com/office/drawing/2016/5/13/chartex" xmlns:cx8="http://schemas.microsoft.com/office/drawing/2016/5/14/chartex" xmlns:mc="http://schemas.openxmlformats.org/markup-compatibility/2006" xmlns:aink="http://schemas.microsoft.com/office/drawing/2016/ink" xmlns:am3d="http://schemas.microsoft.com/office/drawing/2017/model3d" xmlns:o="urn:schemas-microsoft-com:office:office" xmlns:oel="http://schemas.microsoft.com/office/2019/extlst" xmlns:r="http://schemas.openxmlformats.org/officeDocument/2006/relationships" xmlns:m="http://schemas.openxmlformats.org/officeDocument/2006/math" xmlns:v="urn:schemas-microsoft-com:vml" xmlns:wp14="http://schemas.microsoft.com/office/word/2010/wordprocessingDrawing" xmlns:wp="http://schemas.openxmlformats.org/drawingml/2006/wordprocessingDrawing" xmlns:w10="urn:schemas-microsoft-com:office:word" xmlns:w="http://schemas.openxmlformats.org/wordprocessingml/2006/main" xmlns:w14="http://schemas.microsoft.com/office/word/2010/wordml" xmlns:w15="http://schemas.microsoft.com/office/word/2012/wordml" xmlns:w16cex="http://schemas.microsoft.com/office/word/2018/wordml/cex" xmlns:w16cid="http://schemas.microsoft.com/office/word/2016/wordml/cid" xmlns:w16="http://schemas.microsoft.com/office/word/2018/wordml" xmlns:w16du="http://schemas.microsoft.com/office/word/2023/wordml/word16du" xmlns:w16sdtdh="http://schemas.microsoft.com/office/word/2020/wordml/sdtdatahash" xmlns:w16sdtfl="http://schemas.microsoft.com/office/word/2024/wordml/sdtformatlock" xmlns:w16se="http://schemas.microsoft.com/office/word/2015/wordml/symex" xmlns:wpg="http://schemas.microsoft.com/office/word/2010/wordprocessingGroup" xmlns:wpi="http://schemas.microsoft.com/office/word/2010/wordprocessingInk" xmlns:wne="http://schemas.microsoft.com/office/word/2006/wordml" xmlns:wps="http://schemas.microsoft.com/office/word/2010/wordprocessingShape" mc:Ignorable="w14 w15 w16se w16cid w16 w16cex w16sdtdh w16sdtfl w16du wp14">
   <w:body>
     <w:p>
-      <w:hyperlink r:id="rId4" w:history="1">
+      <w:hyperlink r:id="rId5" w:history="1">
         <w:r>
           <w:rPr>
             <w:rStyle w:val="Hyperlink"/>
@@ -109,7 +109,7 @@
       <w:r>
         <w:t xml:space="preserve">GET Method :   </w:t>
       </w:r>
-      <w:hyperlink r:id="rId5" w:history="1">
+      <w:hyperlink r:id="rId6" w:history="1">
         <w:r>
           <w:rPr>
             <w:rStyle w:val="Hyperlink"/>
@@ -298,6 +298,444 @@
       </w:r>
     </w:p>
     <w:p/>
+    <w:p>
+      <w:pPr>
+        <w:rPr>
+          <w:color w:val="4472C4" w:themeColor="accent1"/>
+        </w:rPr>
+      </w:pPr>
+    </w:p>
+    <w:p>
+      <w:pPr>
+        <w:rPr>
+          <w:color w:val="4472C4" w:themeColor="accent1"/>
+        </w:rPr>
+      </w:pPr>
+      <w:r>
+        <w:rPr>
+          <w:color w:val="4472C4" w:themeColor="accent1"/>
+        </w:rPr>
+        <w:t>The page remains compatible with your existing ticketApi.create() and ownDashboardApi.dashboard() APIs.</w:t>
+      </w:r>
+    </w:p>
+    <w:p>
+      <w:pPr>
+        <w:rPr>
+          <w:color w:val="4472C4" w:themeColor="accent1"/>
+        </w:rPr>
+      </w:pPr>
+    </w:p>
+    <w:p>
+      <w:pPr>
+        <w:rPr>
+          <w:color w:val="4472C4" w:themeColor="accent1"/>
+        </w:rPr>
+      </w:pPr>
+    </w:p>
+    <w:p>
+      <w:pPr>
+        <w:rPr>
+          <w:b/>
+          <w:bCs/>
+          <w:color w:val="000000" w:themeColor="text1"/>
+          <w:sz w:val="32"/>
+          <w:szCs w:val="32"/>
+          <w:u w:val="single"/>
+        </w:rPr>
+      </w:pPr>
+      <w:r>
+        <w:rPr>
+          <w:b/>
+          <w:bCs/>
+          <w:color w:val="000000" w:themeColor="text1"/>
+          <w:sz w:val="32"/>
+          <w:szCs w:val="32"/>
+          <w:u w:val="single"/>
+        </w:rPr>
+        <w:t>P</w:t>
+      </w:r>
+      <w:r>
+        <w:rPr>
+          <w:b/>
+          <w:bCs/>
+          <w:color w:val="000000" w:themeColor="text1"/>
+          <w:sz w:val="32"/>
+          <w:szCs w:val="32"/>
+          <w:u w:val="single"/>
+        </w:rPr>
+        <w:t>lease rewrite entire for professional and software industrial</w:t>
+      </w:r>
+    </w:p>
+    <w:p>
+      <w:pPr>
+        <w:rPr>
+          <w:b/>
+          <w:bCs/>
+          <w:color w:val="000000" w:themeColor="text1"/>
+          <w:sz w:val="32"/>
+          <w:szCs w:val="32"/>
+        </w:rPr>
+      </w:pPr>
+    </w:p>
+    <w:p>
+      <w:pPr>
+        <w:rPr>
+          <w:color w:val="000000" w:themeColor="text1"/>
+        </w:rPr>
+      </w:pPr>
+      <w:r>
+        <w:rPr>
+          <w:color w:val="000000" w:themeColor="text1"/>
+        </w:rPr>
+        <w:t xml:space="preserve">Absolutely. For a </w:t>
+      </w:r>
+      <w:r>
+        <w:rPr>
+          <w:b/>
+          <w:bCs/>
+          <w:color w:val="000000" w:themeColor="text1"/>
+        </w:rPr>
+        <w:t>professional / production-style implementation</w:t>
+      </w:r>
+      <w:r>
+        <w:rPr>
+          <w:color w:val="000000" w:themeColor="text1"/>
+        </w:rPr>
+        <w:t>, I would change the current page so that it behaves like a proper enterprise ITSM ticket creation screen:</w:t>
+      </w:r>
+    </w:p>
+    <w:p>
+      <w:pPr>
+        <w:numPr>
+          <w:ilvl w:val="0"/>
+          <w:numId w:val="1"/>
+        </w:numPr>
+        <w:rPr>
+          <w:color w:val="000000" w:themeColor="text1"/>
+        </w:rPr>
+      </w:pPr>
+      <w:r>
+        <w:rPr>
+          <w:color w:val="000000" w:themeColor="text1"/>
+        </w:rPr>
+        <w:t xml:space="preserve">Authenticated employee is loaded once. </w:t>
+      </w:r>
+    </w:p>
+    <w:p>
+      <w:pPr>
+        <w:numPr>
+          <w:ilvl w:val="0"/>
+          <w:numId w:val="1"/>
+        </w:numPr>
+        <w:rPr>
+          <w:color w:val="000000" w:themeColor="text1"/>
+        </w:rPr>
+      </w:pPr>
+      <w:r>
+        <w:rPr>
+          <w:color w:val="000000" w:themeColor="text1"/>
+        </w:rPr>
+        <w:t xml:space="preserve">User can create </w:t>
+      </w:r>
+      <w:r>
+        <w:rPr>
+          <w:b/>
+          <w:bCs/>
+          <w:color w:val="000000" w:themeColor="text1"/>
+        </w:rPr>
+        <w:t>1–10 TT records</w:t>
+      </w:r>
+      <w:r>
+        <w:rPr>
+          <w:color w:val="000000" w:themeColor="text1"/>
+        </w:rPr>
+        <w:t xml:space="preserve">. </w:t>
+      </w:r>
+    </w:p>
+    <w:p>
+      <w:pPr>
+        <w:numPr>
+          <w:ilvl w:val="0"/>
+          <w:numId w:val="1"/>
+        </w:numPr>
+        <w:rPr>
+          <w:color w:val="000000" w:themeColor="text1"/>
+        </w:rPr>
+      </w:pPr>
+      <w:r>
+        <w:rPr>
+          <w:color w:val="000000" w:themeColor="text1"/>
+        </w:rPr>
+        <w:t xml:space="preserve">Each TT is an independent card. </w:t>
+      </w:r>
+    </w:p>
+    <w:p>
+      <w:pPr>
+        <w:numPr>
+          <w:ilvl w:val="0"/>
+          <w:numId w:val="1"/>
+        </w:numPr>
+        <w:rPr>
+          <w:color w:val="000000" w:themeColor="text1"/>
+        </w:rPr>
+      </w:pPr>
+      <w:r>
+        <w:rPr>
+          <w:color w:val="000000" w:themeColor="text1"/>
+        </w:rPr>
+        <w:t xml:space="preserve">Each TT has its own fault type and description. </w:t>
+      </w:r>
+    </w:p>
+    <w:p>
+      <w:pPr>
+        <w:numPr>
+          <w:ilvl w:val="0"/>
+          <w:numId w:val="1"/>
+        </w:numPr>
+        <w:rPr>
+          <w:color w:val="000000" w:themeColor="text1"/>
+        </w:rPr>
+      </w:pPr>
+      <w:r>
+        <w:rPr>
+          <w:color w:val="000000" w:themeColor="text1"/>
+        </w:rPr>
+        <w:t xml:space="preserve">Fault type is a searchable UX dropdown. </w:t>
+      </w:r>
+    </w:p>
+    <w:p>
+      <w:pPr>
+        <w:numPr>
+          <w:ilvl w:val="0"/>
+          <w:numId w:val="1"/>
+        </w:numPr>
+        <w:rPr>
+          <w:color w:val="000000" w:themeColor="text1"/>
+        </w:rPr>
+      </w:pPr>
+      <w:r>
+        <w:rPr>
+          <w:color w:val="000000" w:themeColor="text1"/>
+        </w:rPr>
+        <w:t xml:space="preserve">Backend fault-type ID is </w:t>
+      </w:r>
+      <w:r>
+        <w:rPr>
+          <w:b/>
+          <w:bCs/>
+          <w:color w:val="000000" w:themeColor="text1"/>
+        </w:rPr>
+        <w:t>never shown to the user</w:t>
+      </w:r>
+      <w:r>
+        <w:rPr>
+          <w:color w:val="000000" w:themeColor="text1"/>
+        </w:rPr>
+        <w:t xml:space="preserve">. </w:t>
+      </w:r>
+    </w:p>
+    <w:p>
+      <w:pPr>
+        <w:numPr>
+          <w:ilvl w:val="0"/>
+          <w:numId w:val="1"/>
+        </w:numPr>
+        <w:rPr>
+          <w:color w:val="000000" w:themeColor="text1"/>
+        </w:rPr>
+      </w:pPr>
+      <w:r>
+        <w:rPr>
+          <w:color w:val="000000" w:themeColor="text1"/>
+        </w:rPr>
+        <w:t xml:space="preserve">All tickets are validated </w:t>
+      </w:r>
+      <w:r>
+        <w:rPr>
+          <w:b/>
+          <w:bCs/>
+          <w:color w:val="000000" w:themeColor="text1"/>
+        </w:rPr>
+        <w:t>before any API request</w:t>
+      </w:r>
+      <w:r>
+        <w:rPr>
+          <w:color w:val="000000" w:themeColor="text1"/>
+        </w:rPr>
+        <w:t xml:space="preserve">. </w:t>
+      </w:r>
+    </w:p>
+    <w:p>
+      <w:pPr>
+        <w:numPr>
+          <w:ilvl w:val="0"/>
+          <w:numId w:val="1"/>
+        </w:numPr>
+        <w:rPr>
+          <w:color w:val="000000" w:themeColor="text1"/>
+        </w:rPr>
+      </w:pPr>
+      <w:r>
+        <w:rPr>
+          <w:color w:val="000000" w:themeColor="text1"/>
+        </w:rPr>
+        <w:t xml:space="preserve">Duplicate submission is prevented. </w:t>
+      </w:r>
+    </w:p>
+    <w:p>
+      <w:pPr>
+        <w:numPr>
+          <w:ilvl w:val="0"/>
+          <w:numId w:val="1"/>
+        </w:numPr>
+        <w:rPr>
+          <w:color w:val="000000" w:themeColor="text1"/>
+        </w:rPr>
+      </w:pPr>
+      <w:r>
+        <w:rPr>
+          <w:color w:val="000000" w:themeColor="text1"/>
+        </w:rPr>
+        <w:lastRenderedPageBreak/>
+        <w:t xml:space="preserve">Tickets are created sequentially to reduce backend/API pressure. </w:t>
+      </w:r>
+    </w:p>
+    <w:p>
+      <w:pPr>
+        <w:numPr>
+          <w:ilvl w:val="0"/>
+          <w:numId w:val="1"/>
+        </w:numPr>
+        <w:rPr>
+          <w:color w:val="000000" w:themeColor="text1"/>
+        </w:rPr>
+      </w:pPr>
+      <w:r>
+        <w:rPr>
+          <w:color w:val="000000" w:themeColor="text1"/>
+        </w:rPr>
+        <w:t xml:space="preserve">If some tickets succeed and one fails, the UI clearly reports the partial result instead of falsely saying everything failed. </w:t>
+      </w:r>
+    </w:p>
+    <w:p>
+      <w:pPr>
+        <w:numPr>
+          <w:ilvl w:val="0"/>
+          <w:numId w:val="1"/>
+        </w:numPr>
+        <w:rPr>
+          <w:color w:val="000000" w:themeColor="text1"/>
+        </w:rPr>
+      </w:pPr>
+      <w:r>
+        <w:rPr>
+          <w:color w:val="000000" w:themeColor="text1"/>
+        </w:rPr>
+        <w:t xml:space="preserve">Employee information is automatically inherited by every ticket. </w:t>
+      </w:r>
+    </w:p>
+    <w:p>
+      <w:pPr>
+        <w:numPr>
+          <w:ilvl w:val="0"/>
+          <w:numId w:val="1"/>
+        </w:numPr>
+        <w:rPr>
+          <w:color w:val="000000" w:themeColor="text1"/>
+        </w:rPr>
+      </w:pPr>
+      <w:r>
+        <w:rPr>
+          <w:color w:val="000000" w:themeColor="text1"/>
+        </w:rPr>
+        <w:t xml:space="preserve">The page remains compatible with your existing ticketApi.create() and ownDashboardApi.dashboard() APIs. </w:t>
+      </w:r>
+    </w:p>
+    <w:p>
+      <w:pPr>
+        <w:numPr>
+          <w:ilvl w:val="0"/>
+          <w:numId w:val="1"/>
+        </w:numPr>
+        <w:rPr>
+          <w:color w:val="000000" w:themeColor="text1"/>
+        </w:rPr>
+      </w:pPr>
+      <w:r>
+        <w:rPr>
+          <w:color w:val="000000" w:themeColor="text1"/>
+        </w:rPr>
+        <w:t>The current page already uses those two APIs for employee and fault-type loading.</w:t>
+      </w:r>
+    </w:p>
+    <w:p>
+      <w:pPr>
+        <w:rPr>
+          <w:color w:val="000000" w:themeColor="text1"/>
+        </w:rPr>
+      </w:pPr>
+    </w:p>
+    <w:p>
+      <w:pPr>
+        <w:rPr>
+          <w:color w:val="000000" w:themeColor="text1"/>
+        </w:rPr>
+      </w:pPr>
+    </w:p>
+    <w:p>
+      <w:pPr>
+        <w:rPr>
+          <w:color w:val="000000" w:themeColor="text1"/>
+        </w:rPr>
+      </w:pPr>
+      <w:r>
+        <w:rPr>
+          <w:color w:val="000000" w:themeColor="text1"/>
+        </w:rPr>
+        <w:drawing>
+          <wp:inline distT="0" distB="0" distL="0" distR="0" wp14:anchorId="7854BDB8" wp14:editId="7F4AF903">
+            <wp:extent cx="5943600" cy="3597275"/>
+            <wp:effectExtent l="0" t="0" r="0" b="3175"/>
+            <wp:docPr id="1130186381" name="Picture 1"/>
+            <wp:cNvGraphicFramePr>
+              <a:graphicFrameLocks xmlns:a="http://schemas.openxmlformats.org/drawingml/2006/main" noChangeAspect="1"/>
+            </wp:cNvGraphicFramePr>
+            <a:graphic xmlns:a="http://schemas.openxmlformats.org/drawingml/2006/main">
+              <a:graphicData uri="http://schemas.openxmlformats.org/drawingml/2006/picture">
+                <pic:pic xmlns:pic="http://schemas.openxmlformats.org/drawingml/2006/picture">
+                  <pic:nvPicPr>
+                    <pic:cNvPr id="1130186381" name=""/>
+                    <pic:cNvPicPr/>
+                  </pic:nvPicPr>
+                  <pic:blipFill>
+                    <a:blip r:embed="rId7"/>
+                    <a:stretch>
+                      <a:fillRect/>
+                    </a:stretch>
+                  </pic:blipFill>
+                  <pic:spPr>
+                    <a:xfrm>
+                      <a:off x="0" y="0"/>
+                      <a:ext cx="5943600" cy="3597275"/>
+                    </a:xfrm>
+                    <a:prstGeom prst="rect">
+                      <a:avLst/>
+                    </a:prstGeom>
+                  </pic:spPr>
+                </pic:pic>
+              </a:graphicData>
+            </a:graphic>
+          </wp:inline>
+        </w:drawing>
+      </w:r>
+    </w:p>
+    <w:p>
+      <w:pPr>
+        <w:rPr>
+          <w:color w:val="4472C4" w:themeColor="accent1"/>
+        </w:rPr>
+      </w:pPr>
+    </w:p>
     <w:sectPr>
       <w:pgSz w:w="12240" w:h="15840"/>
       <w:pgMar w:top="1440" w:right="1440" w:bottom="1440" w:left="1440" w:header="720" w:footer="720" w:gutter="0"/>
@@ -306,6 +744,163 @@
     </w:sectPr>
   </w:body>
 </w:document>
+</file>
+
+<file path=word/numbering.xml><?xml version="1.0" encoding="utf-8"?>
+<w:numbering xmlns:wpc="http://schemas.microsoft.com/office/word/2010/wordprocessingCanvas" xmlns:cx="http://schemas.microsoft.com/office/drawing/2014/chartex" xmlns:cx1="http://schemas.microsoft.com/office/drawing/2015/9/8/chartex" xmlns:cx2="http://schemas.microsoft.com/office/drawing/2015/10/21/chartex" xmlns:cx3="http://schemas.microsoft.com/office/drawing/2016/5/9/chartex" xmlns:cx4="http://schemas.microsoft.com/office/drawing/2016/5/10/chartex" xmlns:cx5="http://schemas.microsoft.com/office/drawing/2016/5/11/chartex" xmlns:cx6="http://schemas.microsoft.com/office/drawing/2016/5/12/chartex" xmlns:cx7="http://schemas.microsoft.com/office/drawing/2016/5/13/chartex" xmlns:cx8="http://schemas.microsoft.com/office/drawing/2016/5/14/chartex" xmlns:mc="http://schemas.openxmlformats.org/markup-compatibility/2006" xmlns:aink="http://schemas.microsoft.com/office/drawing/2016/ink" xmlns:am3d="http://schemas.microsoft.com/office/drawing/2017/model3d" xmlns:o="urn:schemas-microsoft-com:office:office" xmlns:oel="http://schemas.microsoft.com/office/2019/extlst" xmlns:r="http://schemas.openxmlformats.org/officeDocument/2006/relationships" xmlns:m="http://schemas.openxmlformats.org/officeDocument/2006/math" xmlns:v="urn:schemas-microsoft-com:vml" xmlns:wp14="http://schemas.microsoft.com/office/word/2010/wordprocessingDrawing" xmlns:wp="http://schemas.openxmlformats.org/drawingml/2006/wordprocessingDrawing" xmlns:w10="urn:schemas-microsoft-com:office:word" xmlns:w="http://schemas.openxmlformats.org/wordprocessingml/2006/main" xmlns:w14="http://schemas.microsoft.com/office/word/2010/wordml" xmlns:w15="http://schemas.microsoft.com/office/word/2012/wordml" xmlns:w16cex="http://schemas.microsoft.com/office/word/2018/wordml/cex" xmlns:w16cid="http://schemas.microsoft.com/office/word/2016/wordml/cid" xmlns:w16="http://schemas.microsoft.com/office/word/2018/wordml" xmlns:w16du="http://schemas.microsoft.com/office/word/2023/wordml/word16du" xmlns:w16sdtdh="http://schemas.microsoft.com/office/word/2020/wordml/sdtdatahash" xmlns:w16sdtfl="http://schemas.microsoft.com/office/word/2024/wordml/sdtformatlock" xmlns:w16se="http://schemas.microsoft.com/office/word/2015/wordml/symex" xmlns:wpg="http://schemas.microsoft.com/office/word/2010/wordprocessingGroup" xmlns:wpi="http://schemas.microsoft.com/office/word/2010/wordprocessingInk" xmlns:wne="http://schemas.microsoft.com/office/word/2006/wordml" xmlns:wps="http://schemas.microsoft.com/office/word/2010/wordprocessingShape" mc:Ignorable="w14 w15 w16se w16cid w16 w16cex w16sdtdh w16sdtfl w16du wp14">
+  <w:abstractNum w:abstractNumId="0" w15:restartNumberingAfterBreak="0">
+    <w:nsid w:val="2B646590"/>
+    <w:multiLevelType w:val="multilevel"/>
+    <w:tmpl w:val="47FAD990"/>
+    <w:lvl w:ilvl="0">
+      <w:start w:val="1"/>
+      <w:numFmt w:val="bullet"/>
+      <w:lvlText w:val=""/>
+      <w:lvlJc w:val="left"/>
+      <w:pPr>
+        <w:tabs>
+          <w:tab w:val="num" w:pos="720"/>
+        </w:tabs>
+        <w:ind w:left="720" w:hanging="360"/>
+      </w:pPr>
+      <w:rPr>
+        <w:rFonts w:ascii="Symbol" w:hAnsi="Symbol" w:hint="default"/>
+        <w:sz w:val="20"/>
+      </w:rPr>
+    </w:lvl>
+    <w:lvl w:ilvl="1" w:tentative="1">
+      <w:start w:val="1"/>
+      <w:numFmt w:val="bullet"/>
+      <w:lvlText w:val="o"/>
+      <w:lvlJc w:val="left"/>
+      <w:pPr>
+        <w:tabs>
+          <w:tab w:val="num" w:pos="1440"/>
+        </w:tabs>
+        <w:ind w:left="1440" w:hanging="360"/>
+      </w:pPr>
+      <w:rPr>
+        <w:rFonts w:ascii="Courier New" w:hAnsi="Courier New" w:hint="default"/>
+        <w:sz w:val="20"/>
+      </w:rPr>
+    </w:lvl>
+    <w:lvl w:ilvl="2" w:tentative="1">
+      <w:start w:val="1"/>
+      <w:numFmt w:val="bullet"/>
+      <w:lvlText w:val=""/>
+      <w:lvlJc w:val="left"/>
+      <w:pPr>
+        <w:tabs>
+          <w:tab w:val="num" w:pos="2160"/>
+        </w:tabs>
+        <w:ind w:left="2160" w:hanging="360"/>
+      </w:pPr>
+      <w:rPr>
+        <w:rFonts w:ascii="Wingdings" w:hAnsi="Wingdings" w:hint="default"/>
+        <w:sz w:val="20"/>
+      </w:rPr>
+    </w:lvl>
+    <w:lvl w:ilvl="3" w:tentative="1">
+      <w:start w:val="1"/>
+      <w:numFmt w:val="bullet"/>
+      <w:lvlText w:val=""/>
+      <w:lvlJc w:val="left"/>
+      <w:pPr>
+        <w:tabs>
+          <w:tab w:val="num" w:pos="2880"/>
+        </w:tabs>
+        <w:ind w:left="2880" w:hanging="360"/>
+      </w:pPr>
+      <w:rPr>
+        <w:rFonts w:ascii="Wingdings" w:hAnsi="Wingdings" w:hint="default"/>
+        <w:sz w:val="20"/>
+      </w:rPr>
+    </w:lvl>
+    <w:lvl w:ilvl="4" w:tentative="1">
+      <w:start w:val="1"/>
+      <w:numFmt w:val="bullet"/>
+      <w:lvlText w:val=""/>
+      <w:lvlJc w:val="left"/>
+      <w:pPr>
+        <w:tabs>
+          <w:tab w:val="num" w:pos="3600"/>
+        </w:tabs>
+        <w:ind w:left="3600" w:hanging="360"/>
+      </w:pPr>
+      <w:rPr>
+        <w:rFonts w:ascii="Wingdings" w:hAnsi="Wingdings" w:hint="default"/>
+        <w:sz w:val="20"/>
+      </w:rPr>
+    </w:lvl>
+    <w:lvl w:ilvl="5" w:tentative="1">
+      <w:start w:val="1"/>
+      <w:numFmt w:val="bullet"/>
+      <w:lvlText w:val=""/>
+      <w:lvlJc w:val="left"/>
+      <w:pPr>
+        <w:tabs>
+          <w:tab w:val="num" w:pos="4320"/>
+        </w:tabs>
+        <w:ind w:left="4320" w:hanging="360"/>
+      </w:pPr>
+      <w:rPr>
+        <w:rFonts w:ascii="Wingdings" w:hAnsi="Wingdings" w:hint="default"/>
+        <w:sz w:val="20"/>
+      </w:rPr>
+    </w:lvl>
+    <w:lvl w:ilvl="6" w:tentative="1">
+      <w:start w:val="1"/>
+      <w:numFmt w:val="bullet"/>
+      <w:lvlText w:val=""/>
+      <w:lvlJc w:val="left"/>
+      <w:pPr>
+        <w:tabs>
+          <w:tab w:val="num" w:pos="5040"/>
+        </w:tabs>
+        <w:ind w:left="5040" w:hanging="360"/>
+      </w:pPr>
+      <w:rPr>
+        <w:rFonts w:ascii="Wingdings" w:hAnsi="Wingdings" w:hint="default"/>
+        <w:sz w:val="20"/>
+      </w:rPr>
+    </w:lvl>
+    <w:lvl w:ilvl="7" w:tentative="1">
+      <w:start w:val="1"/>
+      <w:numFmt w:val="bullet"/>
+      <w:lvlText w:val=""/>
+      <w:lvlJc w:val="left"/>
+      <w:pPr>
+        <w:tabs>
+          <w:tab w:val="num" w:pos="5760"/>
+        </w:tabs>
+        <w:ind w:left="5760" w:hanging="360"/>
+      </w:pPr>
+      <w:rPr>
+        <w:rFonts w:ascii="Wingdings" w:hAnsi="Wingdings" w:hint="default"/>
+        <w:sz w:val="20"/>
+      </w:rPr>
+    </w:lvl>
+    <w:lvl w:ilvl="8" w:tentative="1">
+      <w:start w:val="1"/>
+      <w:numFmt w:val="bullet"/>
+      <w:lvlText w:val=""/>
+      <w:lvlJc w:val="left"/>
+      <w:pPr>
+        <w:tabs>
+          <w:tab w:val="num" w:pos="6480"/>
+        </w:tabs>
+        <w:ind w:left="6480" w:hanging="360"/>
+      </w:pPr>
+      <w:rPr>
+        <w:rFonts w:ascii="Wingdings" w:hAnsi="Wingdings" w:hint="default"/>
+        <w:sz w:val="20"/>
+      </w:rPr>
+    </w:lvl>
+  </w:abstractNum>
+  <w:num w:numId="1" w16cid:durableId="226117208">
+    <w:abstractNumId w:val="0"/>
+  </w:num>
+</w:numbering>
 </file>
 
 <file path=word/styles.xml><?xml version="1.0" encoding="utf-8"?>

</xml_diff>

<commit_message>
Multiple TT is Now Inserting Successfullly
</commit_message>
<xml_diff>
--- a/document/create_tt.docx
+++ b/document/create_tt.docx
@@ -3,19 +3,34 @@
 <w:document xmlns:wpc="http://schemas.microsoft.com/office/word/2010/wordprocessingCanvas" xmlns:cx="http://schemas.microsoft.com/office/drawing/2014/chartex" xmlns:cx1="http://schemas.microsoft.com/office/drawing/2015/9/8/chartex" xmlns:cx2="http://schemas.microsoft.com/office/drawing/2015/10/21/chartex" xmlns:cx3="http://schemas.microsoft.com/office/drawing/2016/5/9/chartex" xmlns:cx4="http://schemas.microsoft.com/office/drawing/2016/5/10/chartex" xmlns:cx5="http://schemas.microsoft.com/office/drawing/2016/5/11/chartex" xmlns:cx6="http://schemas.microsoft.com/office/drawing/2016/5/12/chartex" xmlns:cx7="http://schemas.microsoft.com/office/drawing/2016/5/13/chartex" xmlns:cx8="http://schemas.microsoft.com/office/drawing/2016/5/14/chartex" xmlns:mc="http://schemas.openxmlformats.org/markup-compatibility/2006" xmlns:aink="http://schemas.microsoft.com/office/drawing/2016/ink" xmlns:am3d="http://schemas.microsoft.com/office/drawing/2017/model3d" xmlns:o="urn:schemas-microsoft-com:office:office" xmlns:oel="http://schemas.microsoft.com/office/2019/extlst" xmlns:r="http://schemas.openxmlformats.org/officeDocument/2006/relationships" xmlns:m="http://schemas.openxmlformats.org/officeDocument/2006/math" xmlns:v="urn:schemas-microsoft-com:vml" xmlns:wp14="http://schemas.microsoft.com/office/word/2010/wordprocessingDrawing" xmlns:wp="http://schemas.openxmlformats.org/drawingml/2006/wordprocessingDrawing" xmlns:w10="urn:schemas-microsoft-com:office:word" xmlns:w="http://schemas.openxmlformats.org/wordprocessingml/2006/main" xmlns:w14="http://schemas.microsoft.com/office/word/2010/wordml" xmlns:w15="http://schemas.microsoft.com/office/word/2012/wordml" xmlns:w16cex="http://schemas.microsoft.com/office/word/2018/wordml/cex" xmlns:w16cid="http://schemas.microsoft.com/office/word/2016/wordml/cid" xmlns:w16="http://schemas.microsoft.com/office/word/2018/wordml" xmlns:w16du="http://schemas.microsoft.com/office/word/2023/wordml/word16du" xmlns:w16sdtdh="http://schemas.microsoft.com/office/word/2020/wordml/sdtdatahash" xmlns:w16sdtfl="http://schemas.microsoft.com/office/word/2024/wordml/sdtformatlock" xmlns:w16se="http://schemas.microsoft.com/office/word/2015/wordml/symex" xmlns:wpg="http://schemas.microsoft.com/office/word/2010/wordprocessingGroup" xmlns:wpi="http://schemas.microsoft.com/office/word/2010/wordprocessingInk" xmlns:wne="http://schemas.microsoft.com/office/word/2006/wordml" xmlns:wps="http://schemas.microsoft.com/office/word/2010/wordprocessingShape" mc:Ignorable="w14 w15 w16se w16cid w16 w16cex w16sdtdh w16sdtfl w16du wp14">
   <w:body>
     <w:p>
-      <w:hyperlink r:id="rId5" w:history="1">
-        <w:r>
-          <w:rPr>
-            <w:rStyle w:val="Hyperlink"/>
-          </w:rPr>
-          <w:t>https://chatgpt.com/g/g-p-6a5378cdfc588191b929a3b5ca9c1c9a-itm-nextjs/c/6a8a7c40-36f4-83e8-8a59-4ba8633d33b6</w:t>
-        </w:r>
-      </w:hyperlink>
+      <w:r>
+        <w:fldChar w:fldCharType="begin"/>
+      </w:r>
+      <w:r>
+        <w:instrText>HYPERLINK "https://chatgpt.com/g/g-p-6a5378cdfc588191b929a3b5ca9c1c9a-itm-nextjs/c/6a8a7c40-36f4-83e8-8a59-4ba8633d33b6"</w:instrText>
+      </w:r>
+      <w:r>
+        <w:fldChar w:fldCharType="separate"/>
+      </w:r>
+      <w:r>
+        <w:rPr>
+          <w:rStyle w:val="Hyperlink"/>
+        </w:rPr>
+        <w:t>https://chatgpt.com/g/g-p-6a5378cdfc588191b929a3b5ca9c1c9a-itm-nextjs/c/6a8a7c40-36f4-83e8-8a59-4ba8633d33b6</w:t>
+      </w:r>
+      <w:r>
+        <w:fldChar w:fldCharType="end"/>
+      </w:r>
     </w:p>
     <w:p/>
     <w:p>
-      <w:r>
-        <w:t>Date : 30</w:t>
+      <w:proofErr w:type="gramStart"/>
+      <w:r>
+        <w:t>Date :</w:t>
+      </w:r>
+      <w:proofErr w:type="gramEnd"/>
+      <w:r>
+        <w:t xml:space="preserve"> 30</w:t>
       </w:r>
       <w:r>
         <w:rPr>
@@ -24,7 +39,15 @@
         <w:t>th</w:t>
       </w:r>
       <w:r>
-        <w:t xml:space="preserve"> August, 2026</w:t>
+        <w:t xml:space="preserve"> </w:t>
+      </w:r>
+      <w:proofErr w:type="gramStart"/>
+      <w:r>
+        <w:t>August,</w:t>
+      </w:r>
+      <w:proofErr w:type="gramEnd"/>
+      <w:r>
+        <w:t xml:space="preserve"> 2026</w:t>
       </w:r>
     </w:p>
     <w:p/>
@@ -40,8 +63,17 @@
           <w:b/>
           <w:bCs/>
         </w:rPr>
-        <w:t>What this fixes</w:t>
-      </w:r>
+        <w:t xml:space="preserve">What </w:t>
+      </w:r>
+      <w:proofErr w:type="gramStart"/>
+      <w:r>
+        <w:rPr>
+          <w:b/>
+          <w:bCs/>
+        </w:rPr>
+        <w:t>this fixes</w:t>
+      </w:r>
+      <w:proofErr w:type="gramEnd"/>
     </w:p>
     <w:p>
       <w:r>
@@ -60,7 +92,15 @@
     </w:p>
     <w:p>
       <w:r>
-        <w:t>/api/auth/me</w:t>
+        <w:t>/</w:t>
+      </w:r>
+      <w:proofErr w:type="spellStart"/>
+      <w:r>
+        <w:t>api</w:t>
+      </w:r>
+      <w:proofErr w:type="spellEnd"/>
+      <w:r>
+        <w:t>/auth/me</w:t>
       </w:r>
     </w:p>
     <w:p>
@@ -69,9 +109,11 @@
       </w:r>
     </w:p>
     <w:p>
+      <w:proofErr w:type="spellStart"/>
       <w:r>
         <w:t>employee_id</w:t>
       </w:r>
+      <w:proofErr w:type="spellEnd"/>
     </w:p>
     <w:p>
       <w:r>
@@ -79,9 +121,11 @@
       </w:r>
     </w:p>
     <w:p>
+      <w:proofErr w:type="spellStart"/>
       <w:r>
         <w:t>employee_office_info</w:t>
       </w:r>
+      <w:proofErr w:type="spellEnd"/>
     </w:p>
     <w:p>
       <w:r>
@@ -89,9 +133,11 @@
       </w:r>
     </w:p>
     <w:p>
+      <w:proofErr w:type="spellStart"/>
       <w:r>
         <w:t>employee_personal_info</w:t>
       </w:r>
+      <w:proofErr w:type="spellEnd"/>
     </w:p>
     <w:p>
       <w:r>
@@ -107,9 +153,17 @@
     <w:p/>
     <w:p>
       <w:r>
-        <w:t xml:space="preserve">GET Method :   </w:t>
-      </w:r>
-      <w:hyperlink r:id="rId6" w:history="1">
+        <w:t xml:space="preserve">GET </w:t>
+      </w:r>
+      <w:proofErr w:type="gramStart"/>
+      <w:r>
+        <w:t>Method :</w:t>
+      </w:r>
+      <w:proofErr w:type="gramEnd"/>
+      <w:r>
+        <w:t xml:space="preserve">   </w:t>
+      </w:r>
+      <w:hyperlink r:id="rId5" w:history="1">
         <w:r>
           <w:rPr>
             <w:rStyle w:val="Hyperlink"/>
@@ -126,23 +180,59 @@
     </w:p>
     <w:p>
       <w:r>
-        <w:t>    "data": {</w:t>
-      </w:r>
-    </w:p>
-    <w:p>
-      <w:r>
-        <w:t>        "employee": {</w:t>
-      </w:r>
-    </w:p>
-    <w:p>
-      <w:r>
-        <w:t>            "employee_id": "02-0501",</w:t>
+        <w:t>    "data</w:t>
+      </w:r>
+      <w:proofErr w:type="gramStart"/>
+      <w:r>
+        <w:t>": {</w:t>
+      </w:r>
+      <w:proofErr w:type="gramEnd"/>
+    </w:p>
+    <w:p>
+      <w:r>
+        <w:t>        "employee</w:t>
+      </w:r>
+      <w:proofErr w:type="gramStart"/>
+      <w:r>
+        <w:t>": {</w:t>
+      </w:r>
+      <w:proofErr w:type="gramEnd"/>
+    </w:p>
+    <w:p>
+      <w:r>
+        <w:t>            "</w:t>
+      </w:r>
+      <w:proofErr w:type="spellStart"/>
+      <w:proofErr w:type="gramStart"/>
+      <w:r>
+        <w:t>employee</w:t>
+      </w:r>
+      <w:proofErr w:type="gramEnd"/>
+      <w:r>
+        <w:t>_id</w:t>
+      </w:r>
+      <w:proofErr w:type="spellEnd"/>
+      <w:r>
+        <w:t>": "02-0501",</w:t>
       </w:r>
     </w:p>
     <w:p>
       <w:r>
         <w:lastRenderedPageBreak/>
-        <w:t>            "employee_name": "Muhsina Akter",</w:t>
+        <w:t>            "</w:t>
+      </w:r>
+      <w:proofErr w:type="spellStart"/>
+      <w:proofErr w:type="gramStart"/>
+      <w:r>
+        <w:t>employee</w:t>
+      </w:r>
+      <w:proofErr w:type="gramEnd"/>
+      <w:r>
+        <w:t>_name</w:t>
+      </w:r>
+      <w:proofErr w:type="spellEnd"/>
+      <w:r>
+        <w:t>": "Muhsina Akter",</w:t>
       </w:r>
     </w:p>
     <w:p>
@@ -152,17 +242,51 @@
     </w:p>
     <w:p>
       <w:r>
-        <w:t>            "department": "Fiber@Home Global Ltd",</w:t>
-      </w:r>
-    </w:p>
-    <w:p>
-      <w:r>
-        <w:t>            "work_field": "Software Development",</w:t>
-      </w:r>
-    </w:p>
-    <w:p>
-      <w:r>
-        <w:t>            "sub_function": "",</w:t>
+        <w:t>            "department": "</w:t>
+      </w:r>
+      <w:proofErr w:type="spellStart"/>
+      <w:r>
+        <w:t>Fiber@Home</w:t>
+      </w:r>
+      <w:proofErr w:type="spellEnd"/>
+      <w:r>
+        <w:t> Global Ltd",</w:t>
+      </w:r>
+    </w:p>
+    <w:p>
+      <w:r>
+        <w:t>            "</w:t>
+      </w:r>
+      <w:proofErr w:type="spellStart"/>
+      <w:proofErr w:type="gramStart"/>
+      <w:r>
+        <w:t>work</w:t>
+      </w:r>
+      <w:proofErr w:type="gramEnd"/>
+      <w:r>
+        <w:t>_field</w:t>
+      </w:r>
+      <w:proofErr w:type="spellEnd"/>
+      <w:r>
+        <w:t>": "Software Development",</w:t>
+      </w:r>
+    </w:p>
+    <w:p>
+      <w:r>
+        <w:t>            "</w:t>
+      </w:r>
+      <w:proofErr w:type="spellStart"/>
+      <w:proofErr w:type="gramStart"/>
+      <w:r>
+        <w:t>sub</w:t>
+      </w:r>
+      <w:proofErr w:type="gramEnd"/>
+      <w:r>
+        <w:t>_function</w:t>
+      </w:r>
+      <w:proofErr w:type="spellEnd"/>
+      <w:r>
+        <w:t>": "",</w:t>
       </w:r>
     </w:p>
     <w:p>
@@ -172,12 +296,38 @@
     </w:p>
     <w:p>
       <w:r>
-        <w:t>            "personal_cell": "01715022945",</w:t>
-      </w:r>
-    </w:p>
-    <w:p>
-      <w:r>
-        <w:t>            "official_cell": "01847102314",</w:t>
+        <w:t>            "</w:t>
+      </w:r>
+      <w:proofErr w:type="spellStart"/>
+      <w:proofErr w:type="gramStart"/>
+      <w:r>
+        <w:t>personal</w:t>
+      </w:r>
+      <w:proofErr w:type="gramEnd"/>
+      <w:r>
+        <w:t>_cell</w:t>
+      </w:r>
+      <w:proofErr w:type="spellEnd"/>
+      <w:r>
+        <w:t>": "01715022945",</w:t>
+      </w:r>
+    </w:p>
+    <w:p>
+      <w:r>
+        <w:t>            "</w:t>
+      </w:r>
+      <w:proofErr w:type="spellStart"/>
+      <w:proofErr w:type="gramStart"/>
+      <w:r>
+        <w:t>official</w:t>
+      </w:r>
+      <w:proofErr w:type="gramEnd"/>
+      <w:r>
+        <w:t>_cell</w:t>
+      </w:r>
+      <w:proofErr w:type="spellEnd"/>
+      <w:r>
+        <w:t>": "01847102314",</w:t>
       </w:r>
     </w:p>
     <w:p>
@@ -187,12 +337,33 @@
     </w:p>
     <w:p>
       <w:r>
-        <w:t>            "official_email": "muhsina.akter@fiberathome.net",</w:t>
-      </w:r>
-    </w:p>
-    <w:p>
-      <w:r>
-        <w:t>            "picture": "user_images/1401616150.jpg"</w:t>
+        <w:t>            "</w:t>
+      </w:r>
+      <w:proofErr w:type="spellStart"/>
+      <w:proofErr w:type="gramStart"/>
+      <w:r>
+        <w:t>official</w:t>
+      </w:r>
+      <w:proofErr w:type="gramEnd"/>
+      <w:r>
+        <w:t>_email</w:t>
+      </w:r>
+      <w:proofErr w:type="spellEnd"/>
+      <w:r>
+        <w:t>": "muhsina.akter@fiberathome.net",</w:t>
+      </w:r>
+    </w:p>
+    <w:p>
+      <w:r>
+        <w:t>            "picture": "</w:t>
+      </w:r>
+      <w:proofErr w:type="spellStart"/>
+      <w:r>
+        <w:t>user_images</w:t>
+      </w:r>
+      <w:proofErr w:type="spellEnd"/>
+      <w:r>
+        <w:t>/1401616150.jpg"</w:t>
       </w:r>
     </w:p>
     <w:p>
@@ -202,8 +373,13 @@
     </w:p>
     <w:p>
       <w:r>
-        <w:t>        "tickets": {</w:t>
-      </w:r>
+        <w:t>        "tickets</w:t>
+      </w:r>
+      <w:proofErr w:type="gramStart"/>
+      <w:r>
+        <w:t>": {</w:t>
+      </w:r>
+      <w:proofErr w:type="gramEnd"/>
     </w:p>
     <w:p>
       <w:r>
@@ -258,9 +434,14 @@
     <w:p/>
     <w:p/>
     <w:p>
+      <w:proofErr w:type="gramStart"/>
       <w:r>
         <w:lastRenderedPageBreak/>
-        <w:t xml:space="preserve">GET : Method </w:t>
+        <w:t>GET :</w:t>
+      </w:r>
+      <w:proofErr w:type="gramEnd"/>
+      <w:r>
+        <w:t xml:space="preserve"> Method </w:t>
       </w:r>
     </w:p>
     <w:p/>
@@ -315,7 +496,35 @@
         <w:rPr>
           <w:color w:val="4472C4" w:themeColor="accent1"/>
         </w:rPr>
-        <w:t>The page remains compatible with your existing ticketApi.create() and ownDashboardApi.dashboard() APIs.</w:t>
+        <w:t xml:space="preserve">The page remains compatible with your existing </w:t>
+      </w:r>
+      <w:proofErr w:type="spellStart"/>
+      <w:r>
+        <w:rPr>
+          <w:color w:val="4472C4" w:themeColor="accent1"/>
+        </w:rPr>
+        <w:t>ticketApi.create</w:t>
+      </w:r>
+      <w:proofErr w:type="spellEnd"/>
+      <w:r>
+        <w:rPr>
+          <w:color w:val="4472C4" w:themeColor="accent1"/>
+        </w:rPr>
+        <w:t xml:space="preserve">() and </w:t>
+      </w:r>
+      <w:proofErr w:type="spellStart"/>
+      <w:r>
+        <w:rPr>
+          <w:color w:val="4472C4" w:themeColor="accent1"/>
+        </w:rPr>
+        <w:t>ownDashboardApi.dashboard</w:t>
+      </w:r>
+      <w:proofErr w:type="spellEnd"/>
+      <w:r>
+        <w:rPr>
+          <w:color w:val="4472C4" w:themeColor="accent1"/>
+        </w:rPr>
+        <w:t>() APIs.</w:t>
       </w:r>
     </w:p>
     <w:p>
@@ -418,7 +627,21 @@
         <w:rPr>
           <w:color w:val="000000" w:themeColor="text1"/>
         </w:rPr>
-        <w:t xml:space="preserve">Authenticated employee is loaded once. </w:t>
+        <w:t xml:space="preserve">Authenticated </w:t>
+      </w:r>
+      <w:proofErr w:type="gramStart"/>
+      <w:r>
+        <w:rPr>
+          <w:color w:val="000000" w:themeColor="text1"/>
+        </w:rPr>
+        <w:t>employee is</w:t>
+      </w:r>
+      <w:proofErr w:type="gramEnd"/>
+      <w:r>
+        <w:rPr>
+          <w:color w:val="000000" w:themeColor="text1"/>
+        </w:rPr>
+        <w:t xml:space="preserve"> loaded once. </w:t>
       </w:r>
     </w:p>
     <w:p>
@@ -648,7 +871,35 @@
         <w:rPr>
           <w:color w:val="000000" w:themeColor="text1"/>
         </w:rPr>
-        <w:t xml:space="preserve">The page remains compatible with your existing ticketApi.create() and ownDashboardApi.dashboard() APIs. </w:t>
+        <w:t xml:space="preserve">The page remains compatible with your existing </w:t>
+      </w:r>
+      <w:proofErr w:type="spellStart"/>
+      <w:r>
+        <w:rPr>
+          <w:color w:val="000000" w:themeColor="text1"/>
+        </w:rPr>
+        <w:t>ticketApi.create</w:t>
+      </w:r>
+      <w:proofErr w:type="spellEnd"/>
+      <w:r>
+        <w:rPr>
+          <w:color w:val="000000" w:themeColor="text1"/>
+        </w:rPr>
+        <w:t xml:space="preserve">() and </w:t>
+      </w:r>
+      <w:proofErr w:type="spellStart"/>
+      <w:r>
+        <w:rPr>
+          <w:color w:val="000000" w:themeColor="text1"/>
+        </w:rPr>
+        <w:t>ownDashboardApi.dashboard</w:t>
+      </w:r>
+      <w:proofErr w:type="spellEnd"/>
+      <w:r>
+        <w:rPr>
+          <w:color w:val="000000" w:themeColor="text1"/>
+        </w:rPr>
+        <w:t xml:space="preserve">() APIs. </w:t>
       </w:r>
     </w:p>
     <w:p>
@@ -665,31 +916,46 @@
         <w:rPr>
           <w:color w:val="000000" w:themeColor="text1"/>
         </w:rPr>
-        <w:t>The current page already uses those two APIs for employee and fault-type loading.</w:t>
-      </w:r>
-    </w:p>
-    <w:p>
-      <w:pPr>
-        <w:rPr>
-          <w:color w:val="000000" w:themeColor="text1"/>
-        </w:rPr>
-      </w:pPr>
-    </w:p>
-    <w:p>
-      <w:pPr>
-        <w:rPr>
-          <w:color w:val="000000" w:themeColor="text1"/>
-        </w:rPr>
-      </w:pPr>
-    </w:p>
-    <w:p>
-      <w:pPr>
-        <w:rPr>
-          <w:color w:val="000000" w:themeColor="text1"/>
-        </w:rPr>
-      </w:pPr>
-      <w:r>
-        <w:rPr>
+        <w:t xml:space="preserve">The current page already uses those two APIs for </w:t>
+      </w:r>
+      <w:proofErr w:type="gramStart"/>
+      <w:r>
+        <w:rPr>
+          <w:color w:val="000000" w:themeColor="text1"/>
+        </w:rPr>
+        <w:t>employee</w:t>
+      </w:r>
+      <w:proofErr w:type="gramEnd"/>
+      <w:r>
+        <w:rPr>
+          <w:color w:val="000000" w:themeColor="text1"/>
+        </w:rPr>
+        <w:t xml:space="preserve"> and fault-type loading.</w:t>
+      </w:r>
+    </w:p>
+    <w:p>
+      <w:pPr>
+        <w:rPr>
+          <w:color w:val="000000" w:themeColor="text1"/>
+        </w:rPr>
+      </w:pPr>
+    </w:p>
+    <w:p>
+      <w:pPr>
+        <w:rPr>
+          <w:color w:val="000000" w:themeColor="text1"/>
+        </w:rPr>
+      </w:pPr>
+    </w:p>
+    <w:p>
+      <w:pPr>
+        <w:rPr>
+          <w:color w:val="000000" w:themeColor="text1"/>
+        </w:rPr>
+      </w:pPr>
+      <w:r>
+        <w:rPr>
+          <w:noProof/>
           <w:color w:val="000000" w:themeColor="text1"/>
         </w:rPr>
         <w:drawing>
@@ -708,7 +974,7 @@
                     <pic:cNvPicPr/>
                   </pic:nvPicPr>
                   <pic:blipFill>
-                    <a:blip r:embed="rId7"/>
+                    <a:blip r:embed="rId6"/>
                     <a:stretch>
                       <a:fillRect/>
                     </a:stretch>
@@ -733,6 +999,2309 @@
       <w:pPr>
         <w:rPr>
           <w:color w:val="4472C4" w:themeColor="accent1"/>
+        </w:rPr>
+      </w:pPr>
+    </w:p>
+    <w:p>
+      <w:pPr>
+        <w:rPr>
+          <w:color w:val="4472C4" w:themeColor="accent1"/>
+        </w:rPr>
+      </w:pPr>
+    </w:p>
+    <w:p>
+      <w:pPr>
+        <w:rPr>
+          <w:color w:val="4472C4" w:themeColor="accent1"/>
+        </w:rPr>
+      </w:pPr>
+    </w:p>
+    <w:p>
+      <w:pPr>
+        <w:rPr>
+          <w:color w:val="4472C4" w:themeColor="accent1"/>
+        </w:rPr>
+      </w:pPr>
+    </w:p>
+    <w:p>
+      <w:pPr>
+        <w:rPr>
+          <w:color w:val="4472C4" w:themeColor="accent1"/>
+        </w:rPr>
+      </w:pPr>
+      <w:r>
+        <w:rPr>
+          <w:color w:val="4472C4" w:themeColor="accent1"/>
+        </w:rPr>
+        <w:lastRenderedPageBreak/>
+        <w:drawing>
+          <wp:inline distT="0" distB="0" distL="0" distR="0" wp14:anchorId="4C2B199D" wp14:editId="42258134">
+            <wp:extent cx="5943600" cy="3044825"/>
+            <wp:effectExtent l="0" t="0" r="0" b="3175"/>
+            <wp:docPr id="1829039793" name="Picture 1"/>
+            <wp:cNvGraphicFramePr>
+              <a:graphicFrameLocks xmlns:a="http://schemas.openxmlformats.org/drawingml/2006/main" noChangeAspect="1"/>
+            </wp:cNvGraphicFramePr>
+            <a:graphic xmlns:a="http://schemas.openxmlformats.org/drawingml/2006/main">
+              <a:graphicData uri="http://schemas.openxmlformats.org/drawingml/2006/picture">
+                <pic:pic xmlns:pic="http://schemas.openxmlformats.org/drawingml/2006/picture">
+                  <pic:nvPicPr>
+                    <pic:cNvPr id="1829039793" name=""/>
+                    <pic:cNvPicPr/>
+                  </pic:nvPicPr>
+                  <pic:blipFill>
+                    <a:blip r:embed="rId7"/>
+                    <a:stretch>
+                      <a:fillRect/>
+                    </a:stretch>
+                  </pic:blipFill>
+                  <pic:spPr>
+                    <a:xfrm>
+                      <a:off x="0" y="0"/>
+                      <a:ext cx="5943600" cy="3044825"/>
+                    </a:xfrm>
+                    <a:prstGeom prst="rect">
+                      <a:avLst/>
+                    </a:prstGeom>
+                  </pic:spPr>
+                </pic:pic>
+              </a:graphicData>
+            </a:graphic>
+          </wp:inline>
+        </w:drawing>
+      </w:r>
+    </w:p>
+    <w:p>
+      <w:pPr>
+        <w:rPr>
+          <w:color w:val="4472C4" w:themeColor="accent1"/>
+        </w:rPr>
+      </w:pPr>
+    </w:p>
+    <w:p>
+      <w:pPr>
+        <w:rPr>
+          <w:color w:val="4472C4" w:themeColor="accent1"/>
+        </w:rPr>
+      </w:pPr>
+    </w:p>
+    <w:p>
+      <w:pPr>
+        <w:rPr>
+          <w:color w:val="4472C4" w:themeColor="accent1"/>
+        </w:rPr>
+      </w:pPr>
+    </w:p>
+    <w:p>
+      <w:pPr>
+        <w:rPr>
+          <w:color w:val="4472C4" w:themeColor="accent1"/>
+        </w:rPr>
+      </w:pPr>
+    </w:p>
+    <w:p>
+      <w:pPr>
+        <w:rPr>
+          <w:color w:val="4472C4" w:themeColor="accent1"/>
+        </w:rPr>
+      </w:pPr>
+    </w:p>
+    <w:p>
+      <w:pPr>
+        <w:rPr>
+          <w:color w:val="4472C4" w:themeColor="accent1"/>
+        </w:rPr>
+      </w:pPr>
+      <w:r>
+        <w:rPr>
+          <w:color w:val="4472C4" w:themeColor="accent1"/>
+        </w:rPr>
+        <w:drawing>
+          <wp:inline distT="0" distB="0" distL="0" distR="0" wp14:anchorId="60F79330" wp14:editId="2DDB38DD">
+            <wp:extent cx="5943600" cy="3162300"/>
+            <wp:effectExtent l="0" t="0" r="0" b="0"/>
+            <wp:docPr id="2118546627" name="Picture 1"/>
+            <wp:cNvGraphicFramePr>
+              <a:graphicFrameLocks xmlns:a="http://schemas.openxmlformats.org/drawingml/2006/main" noChangeAspect="1"/>
+            </wp:cNvGraphicFramePr>
+            <a:graphic xmlns:a="http://schemas.openxmlformats.org/drawingml/2006/main">
+              <a:graphicData uri="http://schemas.openxmlformats.org/drawingml/2006/picture">
+                <pic:pic xmlns:pic="http://schemas.openxmlformats.org/drawingml/2006/picture">
+                  <pic:nvPicPr>
+                    <pic:cNvPr id="2118546627" name=""/>
+                    <pic:cNvPicPr/>
+                  </pic:nvPicPr>
+                  <pic:blipFill>
+                    <a:blip r:embed="rId8"/>
+                    <a:stretch>
+                      <a:fillRect/>
+                    </a:stretch>
+                  </pic:blipFill>
+                  <pic:spPr>
+                    <a:xfrm>
+                      <a:off x="0" y="0"/>
+                      <a:ext cx="5943600" cy="3162300"/>
+                    </a:xfrm>
+                    <a:prstGeom prst="rect">
+                      <a:avLst/>
+                    </a:prstGeom>
+                  </pic:spPr>
+                </pic:pic>
+              </a:graphicData>
+            </a:graphic>
+          </wp:inline>
+        </w:drawing>
+      </w:r>
+    </w:p>
+    <w:p>
+      <w:pPr>
+        <w:rPr>
+          <w:color w:val="4472C4" w:themeColor="accent1"/>
+        </w:rPr>
+      </w:pPr>
+    </w:p>
+    <w:p>
+      <w:pPr>
+        <w:rPr>
+          <w:color w:val="4472C4" w:themeColor="accent1"/>
+        </w:rPr>
+      </w:pPr>
+    </w:p>
+    <w:p>
+      <w:pPr>
+        <w:rPr>
+          <w:color w:val="4472C4" w:themeColor="accent1"/>
+        </w:rPr>
+      </w:pPr>
+      <w:r>
+        <w:rPr>
+          <w:color w:val="4472C4" w:themeColor="accent1"/>
+        </w:rPr>
+        <w:t>{</w:t>
+      </w:r>
+    </w:p>
+    <w:p>
+      <w:pPr>
+        <w:rPr>
+          <w:color w:val="4472C4" w:themeColor="accent1"/>
+        </w:rPr>
+      </w:pPr>
+      <w:r>
+        <w:rPr>
+          <w:color w:val="4472C4" w:themeColor="accent1"/>
+        </w:rPr>
+        <w:t>    "error": "ERROR: syntax error at or near \"user\" (SQLSTATE 42601)",</w:t>
+      </w:r>
+    </w:p>
+    <w:p>
+      <w:pPr>
+        <w:rPr>
+          <w:color w:val="4472C4" w:themeColor="accent1"/>
+        </w:rPr>
+      </w:pPr>
+      <w:r>
+        <w:rPr>
+          <w:color w:val="4472C4" w:themeColor="accent1"/>
+        </w:rPr>
+        <w:t>    "success": </w:t>
+      </w:r>
+      <w:r>
+        <w:rPr>
+          <w:b/>
+          <w:bCs/>
+          <w:color w:val="4472C4" w:themeColor="accent1"/>
+        </w:rPr>
+        <w:t>false</w:t>
+      </w:r>
+    </w:p>
+    <w:p>
+      <w:pPr>
+        <w:rPr>
+          <w:color w:val="4472C4" w:themeColor="accent1"/>
+        </w:rPr>
+      </w:pPr>
+      <w:r>
+        <w:rPr>
+          <w:color w:val="4472C4" w:themeColor="accent1"/>
+        </w:rPr>
+        <w:t>}</w:t>
+      </w:r>
+    </w:p>
+    <w:p>
+      <w:pPr>
+        <w:rPr>
+          <w:color w:val="4472C4" w:themeColor="accent1"/>
+        </w:rPr>
+      </w:pPr>
+    </w:p>
+    <w:p>
+      <w:pPr>
+        <w:rPr>
+          <w:color w:val="4472C4" w:themeColor="accent1"/>
+        </w:rPr>
+      </w:pPr>
+    </w:p>
+    <w:p>
+      <w:pPr>
+        <w:rPr>
+          <w:color w:val="4472C4" w:themeColor="accent1"/>
+        </w:rPr>
+      </w:pPr>
+    </w:p>
+    <w:p>
+      <w:pPr>
+        <w:rPr>
+          <w:color w:val="4472C4" w:themeColor="accent1"/>
+        </w:rPr>
+      </w:pPr>
+      <w:r>
+        <w:rPr>
+          <w:color w:val="4472C4" w:themeColor="accent1"/>
+        </w:rPr>
+        <w:t>{</w:t>
+      </w:r>
+    </w:p>
+    <w:p>
+      <w:pPr>
+        <w:rPr>
+          <w:color w:val="4472C4" w:themeColor="accent1"/>
+        </w:rPr>
+      </w:pPr>
+      <w:r>
+        <w:rPr>
+          <w:color w:val="4472C4" w:themeColor="accent1"/>
+        </w:rPr>
+        <w:t xml:space="preserve">  "tickets": [</w:t>
+      </w:r>
+    </w:p>
+    <w:p>
+      <w:pPr>
+        <w:rPr>
+          <w:color w:val="4472C4" w:themeColor="accent1"/>
+        </w:rPr>
+      </w:pPr>
+      <w:r>
+        <w:rPr>
+          <w:color w:val="4472C4" w:themeColor="accent1"/>
+        </w:rPr>
+        <w:t xml:space="preserve">    {</w:t>
+      </w:r>
+    </w:p>
+    <w:p>
+      <w:pPr>
+        <w:rPr>
+          <w:color w:val="4472C4" w:themeColor="accent1"/>
+        </w:rPr>
+      </w:pPr>
+      <w:r>
+        <w:rPr>
+          <w:color w:val="4472C4" w:themeColor="accent1"/>
+        </w:rPr>
+        <w:t xml:space="preserve">      "</w:t>
+      </w:r>
+      <w:proofErr w:type="spellStart"/>
+      <w:proofErr w:type="gramStart"/>
+      <w:r>
+        <w:rPr>
+          <w:color w:val="4472C4" w:themeColor="accent1"/>
+        </w:rPr>
+        <w:t>reason</w:t>
+      </w:r>
+      <w:proofErr w:type="gramEnd"/>
+      <w:r>
+        <w:rPr>
+          <w:color w:val="4472C4" w:themeColor="accent1"/>
+        </w:rPr>
+        <w:t>_of_problem</w:t>
+      </w:r>
+      <w:proofErr w:type="spellEnd"/>
+      <w:r>
+        <w:rPr>
+          <w:color w:val="4472C4" w:themeColor="accent1"/>
+        </w:rPr>
+        <w:t>": "Internet connection is not working",</w:t>
+      </w:r>
+    </w:p>
+    <w:p>
+      <w:pPr>
+        <w:rPr>
+          <w:color w:val="4472C4" w:themeColor="accent1"/>
+        </w:rPr>
+      </w:pPr>
+      <w:r>
+        <w:rPr>
+          <w:color w:val="4472C4" w:themeColor="accent1"/>
+        </w:rPr>
+        <w:t xml:space="preserve">      "</w:t>
+      </w:r>
+      <w:proofErr w:type="spellStart"/>
+      <w:proofErr w:type="gramStart"/>
+      <w:r>
+        <w:rPr>
+          <w:color w:val="4472C4" w:themeColor="accent1"/>
+        </w:rPr>
+        <w:t>client</w:t>
+      </w:r>
+      <w:proofErr w:type="gramEnd"/>
+      <w:r>
+        <w:rPr>
+          <w:color w:val="4472C4" w:themeColor="accent1"/>
+        </w:rPr>
+        <w:t>_name</w:t>
+      </w:r>
+      <w:proofErr w:type="spellEnd"/>
+      <w:r>
+        <w:rPr>
+          <w:color w:val="4472C4" w:themeColor="accent1"/>
+        </w:rPr>
+        <w:t>": "</w:t>
+      </w:r>
+      <w:proofErr w:type="spellStart"/>
+      <w:r>
+        <w:rPr>
+          <w:color w:val="4472C4" w:themeColor="accent1"/>
+        </w:rPr>
+        <w:t>Fiber@Home</w:t>
+      </w:r>
+      <w:proofErr w:type="spellEnd"/>
+      <w:r>
+        <w:rPr>
+          <w:color w:val="4472C4" w:themeColor="accent1"/>
+        </w:rPr>
+        <w:t xml:space="preserve"> Global Ltd",</w:t>
+      </w:r>
+    </w:p>
+    <w:p>
+      <w:pPr>
+        <w:rPr>
+          <w:color w:val="4472C4" w:themeColor="accent1"/>
+        </w:rPr>
+      </w:pPr>
+      <w:r>
+        <w:rPr>
+          <w:color w:val="4472C4" w:themeColor="accent1"/>
+        </w:rPr>
+        <w:t xml:space="preserve">      "department": "IT",</w:t>
+      </w:r>
+    </w:p>
+    <w:p>
+      <w:pPr>
+        <w:rPr>
+          <w:color w:val="4472C4" w:themeColor="accent1"/>
+        </w:rPr>
+      </w:pPr>
+      <w:r>
+        <w:rPr>
+          <w:color w:val="4472C4" w:themeColor="accent1"/>
+        </w:rPr>
+        <w:t xml:space="preserve">      "phone": "01847102314",</w:t>
+      </w:r>
+    </w:p>
+    <w:p>
+      <w:pPr>
+        <w:rPr>
+          <w:color w:val="4472C4" w:themeColor="accent1"/>
+        </w:rPr>
+      </w:pPr>
+      <w:r>
+        <w:rPr>
+          <w:color w:val="4472C4" w:themeColor="accent1"/>
+        </w:rPr>
+        <w:t xml:space="preserve">      "email": "employee@example.com",</w:t>
+      </w:r>
+    </w:p>
+    <w:p>
+      <w:pPr>
+        <w:rPr>
+          <w:color w:val="4472C4" w:themeColor="accent1"/>
+        </w:rPr>
+      </w:pPr>
+      <w:r>
+        <w:rPr>
+          <w:color w:val="4472C4" w:themeColor="accent1"/>
+        </w:rPr>
+        <w:t xml:space="preserve">      "</w:t>
+      </w:r>
+      <w:proofErr w:type="spellStart"/>
+      <w:proofErr w:type="gramStart"/>
+      <w:r>
+        <w:rPr>
+          <w:color w:val="4472C4" w:themeColor="accent1"/>
+        </w:rPr>
+        <w:t>fault</w:t>
+      </w:r>
+      <w:proofErr w:type="gramEnd"/>
+      <w:r>
+        <w:rPr>
+          <w:color w:val="4472C4" w:themeColor="accent1"/>
+        </w:rPr>
+        <w:t>_type</w:t>
+      </w:r>
+      <w:proofErr w:type="spellEnd"/>
+      <w:r>
+        <w:rPr>
+          <w:color w:val="4472C4" w:themeColor="accent1"/>
+        </w:rPr>
+        <w:t>": 1</w:t>
+      </w:r>
+    </w:p>
+    <w:p>
+      <w:pPr>
+        <w:rPr>
+          <w:color w:val="4472C4" w:themeColor="accent1"/>
+        </w:rPr>
+      </w:pPr>
+      <w:r>
+        <w:rPr>
+          <w:color w:val="4472C4" w:themeColor="accent1"/>
+        </w:rPr>
+        <w:t xml:space="preserve">    },</w:t>
+      </w:r>
+    </w:p>
+    <w:p>
+      <w:pPr>
+        <w:rPr>
+          <w:color w:val="4472C4" w:themeColor="accent1"/>
+        </w:rPr>
+      </w:pPr>
+      <w:r>
+        <w:rPr>
+          <w:color w:val="4472C4" w:themeColor="accent1"/>
+        </w:rPr>
+        <w:t xml:space="preserve">    {</w:t>
+      </w:r>
+    </w:p>
+    <w:p>
+      <w:pPr>
+        <w:rPr>
+          <w:color w:val="4472C4" w:themeColor="accent1"/>
+        </w:rPr>
+      </w:pPr>
+      <w:r>
+        <w:rPr>
+          <w:color w:val="4472C4" w:themeColor="accent1"/>
+        </w:rPr>
+        <w:t xml:space="preserve">      "</w:t>
+      </w:r>
+      <w:proofErr w:type="spellStart"/>
+      <w:proofErr w:type="gramStart"/>
+      <w:r>
+        <w:rPr>
+          <w:color w:val="4472C4" w:themeColor="accent1"/>
+        </w:rPr>
+        <w:t>reason</w:t>
+      </w:r>
+      <w:proofErr w:type="gramEnd"/>
+      <w:r>
+        <w:rPr>
+          <w:color w:val="4472C4" w:themeColor="accent1"/>
+        </w:rPr>
+        <w:t>_of_problem</w:t>
+      </w:r>
+      <w:proofErr w:type="spellEnd"/>
+      <w:r>
+        <w:rPr>
+          <w:color w:val="4472C4" w:themeColor="accent1"/>
+        </w:rPr>
+        <w:t>": "Laptop keyboard is damaged",</w:t>
+      </w:r>
+    </w:p>
+    <w:p>
+      <w:pPr>
+        <w:rPr>
+          <w:color w:val="4472C4" w:themeColor="accent1"/>
+        </w:rPr>
+      </w:pPr>
+      <w:r>
+        <w:rPr>
+          <w:color w:val="4472C4" w:themeColor="accent1"/>
+        </w:rPr>
+        <w:t xml:space="preserve">      "</w:t>
+      </w:r>
+      <w:proofErr w:type="spellStart"/>
+      <w:proofErr w:type="gramStart"/>
+      <w:r>
+        <w:rPr>
+          <w:color w:val="4472C4" w:themeColor="accent1"/>
+        </w:rPr>
+        <w:t>client</w:t>
+      </w:r>
+      <w:proofErr w:type="gramEnd"/>
+      <w:r>
+        <w:rPr>
+          <w:color w:val="4472C4" w:themeColor="accent1"/>
+        </w:rPr>
+        <w:t>_name</w:t>
+      </w:r>
+      <w:proofErr w:type="spellEnd"/>
+      <w:r>
+        <w:rPr>
+          <w:color w:val="4472C4" w:themeColor="accent1"/>
+        </w:rPr>
+        <w:t>": "</w:t>
+      </w:r>
+      <w:proofErr w:type="spellStart"/>
+      <w:r>
+        <w:rPr>
+          <w:color w:val="4472C4" w:themeColor="accent1"/>
+        </w:rPr>
+        <w:t>Fiber@Home</w:t>
+      </w:r>
+      <w:proofErr w:type="spellEnd"/>
+      <w:r>
+        <w:rPr>
+          <w:color w:val="4472C4" w:themeColor="accent1"/>
+        </w:rPr>
+        <w:t xml:space="preserve"> Global Ltd",</w:t>
+      </w:r>
+    </w:p>
+    <w:p>
+      <w:pPr>
+        <w:rPr>
+          <w:color w:val="4472C4" w:themeColor="accent1"/>
+        </w:rPr>
+      </w:pPr>
+      <w:r>
+        <w:rPr>
+          <w:color w:val="4472C4" w:themeColor="accent1"/>
+        </w:rPr>
+        <w:t xml:space="preserve">      "department": "IT",</w:t>
+      </w:r>
+    </w:p>
+    <w:p>
+      <w:pPr>
+        <w:rPr>
+          <w:color w:val="4472C4" w:themeColor="accent1"/>
+        </w:rPr>
+      </w:pPr>
+      <w:r>
+        <w:rPr>
+          <w:color w:val="4472C4" w:themeColor="accent1"/>
+        </w:rPr>
+        <w:t xml:space="preserve">      "phone": "01847102314",</w:t>
+      </w:r>
+    </w:p>
+    <w:p>
+      <w:pPr>
+        <w:rPr>
+          <w:color w:val="4472C4" w:themeColor="accent1"/>
+        </w:rPr>
+      </w:pPr>
+      <w:r>
+        <w:rPr>
+          <w:color w:val="4472C4" w:themeColor="accent1"/>
+        </w:rPr>
+        <w:t xml:space="preserve">      "email": "employee@example.com",</w:t>
+      </w:r>
+    </w:p>
+    <w:p>
+      <w:pPr>
+        <w:rPr>
+          <w:color w:val="4472C4" w:themeColor="accent1"/>
+        </w:rPr>
+      </w:pPr>
+      <w:r>
+        <w:rPr>
+          <w:color w:val="4472C4" w:themeColor="accent1"/>
+        </w:rPr>
+        <w:t xml:space="preserve">      "</w:t>
+      </w:r>
+      <w:proofErr w:type="spellStart"/>
+      <w:proofErr w:type="gramStart"/>
+      <w:r>
+        <w:rPr>
+          <w:color w:val="4472C4" w:themeColor="accent1"/>
+        </w:rPr>
+        <w:t>fault</w:t>
+      </w:r>
+      <w:proofErr w:type="gramEnd"/>
+      <w:r>
+        <w:rPr>
+          <w:color w:val="4472C4" w:themeColor="accent1"/>
+        </w:rPr>
+        <w:t>_type</w:t>
+      </w:r>
+      <w:proofErr w:type="spellEnd"/>
+      <w:r>
+        <w:rPr>
+          <w:color w:val="4472C4" w:themeColor="accent1"/>
+        </w:rPr>
+        <w:t>": 3</w:t>
+      </w:r>
+    </w:p>
+    <w:p>
+      <w:pPr>
+        <w:rPr>
+          <w:color w:val="4472C4" w:themeColor="accent1"/>
+        </w:rPr>
+      </w:pPr>
+      <w:r>
+        <w:rPr>
+          <w:color w:val="4472C4" w:themeColor="accent1"/>
+        </w:rPr>
+        <w:lastRenderedPageBreak/>
+        <w:t xml:space="preserve">    },</w:t>
+      </w:r>
+    </w:p>
+    <w:p>
+      <w:pPr>
+        <w:rPr>
+          <w:color w:val="4472C4" w:themeColor="accent1"/>
+        </w:rPr>
+      </w:pPr>
+      <w:r>
+        <w:rPr>
+          <w:color w:val="4472C4" w:themeColor="accent1"/>
+        </w:rPr>
+        <w:t xml:space="preserve">    {</w:t>
+      </w:r>
+    </w:p>
+    <w:p>
+      <w:pPr>
+        <w:rPr>
+          <w:color w:val="4472C4" w:themeColor="accent1"/>
+        </w:rPr>
+      </w:pPr>
+      <w:r>
+        <w:rPr>
+          <w:color w:val="4472C4" w:themeColor="accent1"/>
+        </w:rPr>
+        <w:t xml:space="preserve">      "</w:t>
+      </w:r>
+      <w:proofErr w:type="spellStart"/>
+      <w:proofErr w:type="gramStart"/>
+      <w:r>
+        <w:rPr>
+          <w:color w:val="4472C4" w:themeColor="accent1"/>
+        </w:rPr>
+        <w:t>reason</w:t>
+      </w:r>
+      <w:proofErr w:type="gramEnd"/>
+      <w:r>
+        <w:rPr>
+          <w:color w:val="4472C4" w:themeColor="accent1"/>
+        </w:rPr>
+        <w:t>_of_problem</w:t>
+      </w:r>
+      <w:proofErr w:type="spellEnd"/>
+      <w:r>
+        <w:rPr>
+          <w:color w:val="4472C4" w:themeColor="accent1"/>
+        </w:rPr>
+        <w:t>": "Printer is not responding",</w:t>
+      </w:r>
+    </w:p>
+    <w:p>
+      <w:pPr>
+        <w:rPr>
+          <w:color w:val="4472C4" w:themeColor="accent1"/>
+        </w:rPr>
+      </w:pPr>
+      <w:r>
+        <w:rPr>
+          <w:color w:val="4472C4" w:themeColor="accent1"/>
+        </w:rPr>
+        <w:t xml:space="preserve">      "</w:t>
+      </w:r>
+      <w:proofErr w:type="spellStart"/>
+      <w:proofErr w:type="gramStart"/>
+      <w:r>
+        <w:rPr>
+          <w:color w:val="4472C4" w:themeColor="accent1"/>
+        </w:rPr>
+        <w:t>client</w:t>
+      </w:r>
+      <w:proofErr w:type="gramEnd"/>
+      <w:r>
+        <w:rPr>
+          <w:color w:val="4472C4" w:themeColor="accent1"/>
+        </w:rPr>
+        <w:t>_name</w:t>
+      </w:r>
+      <w:proofErr w:type="spellEnd"/>
+      <w:r>
+        <w:rPr>
+          <w:color w:val="4472C4" w:themeColor="accent1"/>
+        </w:rPr>
+        <w:t>": "</w:t>
+      </w:r>
+      <w:proofErr w:type="spellStart"/>
+      <w:r>
+        <w:rPr>
+          <w:color w:val="4472C4" w:themeColor="accent1"/>
+        </w:rPr>
+        <w:t>Fiber@Home</w:t>
+      </w:r>
+      <w:proofErr w:type="spellEnd"/>
+      <w:r>
+        <w:rPr>
+          <w:color w:val="4472C4" w:themeColor="accent1"/>
+        </w:rPr>
+        <w:t xml:space="preserve"> Global Ltd",</w:t>
+      </w:r>
+    </w:p>
+    <w:p>
+      <w:pPr>
+        <w:rPr>
+          <w:color w:val="4472C4" w:themeColor="accent1"/>
+        </w:rPr>
+      </w:pPr>
+      <w:r>
+        <w:rPr>
+          <w:color w:val="4472C4" w:themeColor="accent1"/>
+        </w:rPr>
+        <w:t xml:space="preserve">      "department": "IT",</w:t>
+      </w:r>
+    </w:p>
+    <w:p>
+      <w:pPr>
+        <w:rPr>
+          <w:color w:val="4472C4" w:themeColor="accent1"/>
+        </w:rPr>
+      </w:pPr>
+      <w:r>
+        <w:rPr>
+          <w:color w:val="4472C4" w:themeColor="accent1"/>
+        </w:rPr>
+        <w:t xml:space="preserve">      "phone": "01847102314",</w:t>
+      </w:r>
+    </w:p>
+    <w:p>
+      <w:pPr>
+        <w:rPr>
+          <w:color w:val="4472C4" w:themeColor="accent1"/>
+        </w:rPr>
+      </w:pPr>
+      <w:r>
+        <w:rPr>
+          <w:color w:val="4472C4" w:themeColor="accent1"/>
+        </w:rPr>
+        <w:t xml:space="preserve">      "email": "employee@example.com",</w:t>
+      </w:r>
+    </w:p>
+    <w:p>
+      <w:pPr>
+        <w:rPr>
+          <w:color w:val="4472C4" w:themeColor="accent1"/>
+        </w:rPr>
+      </w:pPr>
+      <w:r>
+        <w:rPr>
+          <w:color w:val="4472C4" w:themeColor="accent1"/>
+        </w:rPr>
+        <w:t xml:space="preserve">      "</w:t>
+      </w:r>
+      <w:proofErr w:type="spellStart"/>
+      <w:proofErr w:type="gramStart"/>
+      <w:r>
+        <w:rPr>
+          <w:color w:val="4472C4" w:themeColor="accent1"/>
+        </w:rPr>
+        <w:t>fault</w:t>
+      </w:r>
+      <w:proofErr w:type="gramEnd"/>
+      <w:r>
+        <w:rPr>
+          <w:color w:val="4472C4" w:themeColor="accent1"/>
+        </w:rPr>
+        <w:t>_type</w:t>
+      </w:r>
+      <w:proofErr w:type="spellEnd"/>
+      <w:r>
+        <w:rPr>
+          <w:color w:val="4472C4" w:themeColor="accent1"/>
+        </w:rPr>
+        <w:t>": 5</w:t>
+      </w:r>
+    </w:p>
+    <w:p>
+      <w:pPr>
+        <w:rPr>
+          <w:color w:val="4472C4" w:themeColor="accent1"/>
+        </w:rPr>
+      </w:pPr>
+      <w:r>
+        <w:rPr>
+          <w:color w:val="4472C4" w:themeColor="accent1"/>
+        </w:rPr>
+        <w:t xml:space="preserve">    }</w:t>
+      </w:r>
+    </w:p>
+    <w:p>
+      <w:pPr>
+        <w:rPr>
+          <w:color w:val="4472C4" w:themeColor="accent1"/>
+        </w:rPr>
+      </w:pPr>
+      <w:r>
+        <w:rPr>
+          <w:color w:val="4472C4" w:themeColor="accent1"/>
+        </w:rPr>
+        <w:t xml:space="preserve">  ]</w:t>
+      </w:r>
+    </w:p>
+    <w:p>
+      <w:pPr>
+        <w:rPr>
+          <w:color w:val="4472C4" w:themeColor="accent1"/>
+        </w:rPr>
+      </w:pPr>
+      <w:r>
+        <w:rPr>
+          <w:color w:val="4472C4" w:themeColor="accent1"/>
+        </w:rPr>
+        <w:t>}</w:t>
+      </w:r>
+    </w:p>
+    <w:p>
+      <w:pPr>
+        <w:rPr>
+          <w:color w:val="4472C4" w:themeColor="accent1"/>
+        </w:rPr>
+      </w:pPr>
+    </w:p>
+    <w:p>
+      <w:pPr>
+        <w:rPr>
+          <w:color w:val="4472C4" w:themeColor="accent1"/>
+        </w:rPr>
+      </w:pPr>
+    </w:p>
+    <w:p>
+      <w:pPr>
+        <w:rPr>
+          <w:color w:val="4472C4" w:themeColor="accent1"/>
+        </w:rPr>
+      </w:pPr>
+    </w:p>
+    <w:p>
+      <w:pPr>
+        <w:rPr>
+          <w:color w:val="4472C4" w:themeColor="accent1"/>
+        </w:rPr>
+      </w:pPr>
+    </w:p>
+    <w:p>
+      <w:pPr>
+        <w:rPr>
+          <w:color w:val="4472C4" w:themeColor="accent1"/>
+        </w:rPr>
+      </w:pPr>
+    </w:p>
+    <w:p>
+      <w:pPr>
+        <w:rPr>
+          <w:color w:val="4472C4" w:themeColor="accent1"/>
+        </w:rPr>
+      </w:pPr>
+    </w:p>
+    <w:p>
+      <w:pPr>
+        <w:rPr>
+          <w:color w:val="4472C4" w:themeColor="accent1"/>
+        </w:rPr>
+      </w:pPr>
+    </w:p>
+    <w:p>
+      <w:pPr>
+        <w:rPr>
+          <w:color w:val="4472C4" w:themeColor="accent1"/>
+        </w:rPr>
+      </w:pPr>
+    </w:p>
+    <w:p>
+      <w:pPr>
+        <w:rPr>
+          <w:color w:val="4472C4" w:themeColor="accent1"/>
+        </w:rPr>
+      </w:pPr>
+    </w:p>
+    <w:p>
+      <w:pPr>
+        <w:rPr>
+          <w:color w:val="4472C4" w:themeColor="accent1"/>
+        </w:rPr>
+      </w:pPr>
+    </w:p>
+    <w:p>
+      <w:pPr>
+        <w:rPr>
+          <w:color w:val="4472C4" w:themeColor="accent1"/>
+        </w:rPr>
+      </w:pPr>
+    </w:p>
+    <w:p>
+      <w:pPr>
+        <w:rPr>
+          <w:color w:val="4472C4" w:themeColor="accent1"/>
+        </w:rPr>
+      </w:pPr>
+    </w:p>
+    <w:p>
+      <w:pPr>
+        <w:rPr>
+          <w:color w:val="4472C4" w:themeColor="accent1"/>
+        </w:rPr>
+      </w:pPr>
+    </w:p>
+    <w:p>
+      <w:pPr>
+        <w:rPr>
+          <w:color w:val="4472C4" w:themeColor="accent1"/>
+        </w:rPr>
+      </w:pPr>
+    </w:p>
+    <w:p>
+      <w:pPr>
+        <w:rPr>
+          <w:color w:val="4472C4" w:themeColor="accent1"/>
+        </w:rPr>
+      </w:pPr>
+    </w:p>
+    <w:p>
+      <w:pPr>
+        <w:rPr>
+          <w:color w:val="4472C4" w:themeColor="accent1"/>
+        </w:rPr>
+      </w:pPr>
+    </w:p>
+    <w:p>
+      <w:pPr>
+        <w:rPr>
+          <w:color w:val="4472C4" w:themeColor="accent1"/>
+        </w:rPr>
+      </w:pPr>
+    </w:p>
+    <w:p>
+      <w:pPr>
+        <w:rPr>
+          <w:color w:val="000000" w:themeColor="text1"/>
+        </w:rPr>
+      </w:pPr>
+      <w:r>
+        <w:rPr>
+          <w:color w:val="000000" w:themeColor="text1"/>
+        </w:rPr>
+        <w:t>SELECT</w:t>
+      </w:r>
+    </w:p>
+    <w:p>
+      <w:pPr>
+        <w:rPr>
+          <w:color w:val="000000" w:themeColor="text1"/>
+        </w:rPr>
+      </w:pPr>
+      <w:r>
+        <w:rPr>
+          <w:color w:val="000000" w:themeColor="text1"/>
+        </w:rPr>
+        <w:t xml:space="preserve">    </w:t>
+      </w:r>
+      <w:proofErr w:type="spellStart"/>
+      <w:r>
+        <w:rPr>
+          <w:color w:val="000000" w:themeColor="text1"/>
+        </w:rPr>
+        <w:t>ordinal_position</w:t>
+      </w:r>
+      <w:proofErr w:type="spellEnd"/>
+      <w:r>
+        <w:rPr>
+          <w:color w:val="000000" w:themeColor="text1"/>
+        </w:rPr>
+        <w:t>,</w:t>
+      </w:r>
+    </w:p>
+    <w:p>
+      <w:pPr>
+        <w:rPr>
+          <w:color w:val="000000" w:themeColor="text1"/>
+        </w:rPr>
+      </w:pPr>
+      <w:r>
+        <w:rPr>
+          <w:color w:val="000000" w:themeColor="text1"/>
+        </w:rPr>
+        <w:t xml:space="preserve">    </w:t>
+      </w:r>
+      <w:proofErr w:type="spellStart"/>
+      <w:r>
+        <w:rPr>
+          <w:color w:val="000000" w:themeColor="text1"/>
+        </w:rPr>
+        <w:t>column_name</w:t>
+      </w:r>
+      <w:proofErr w:type="spellEnd"/>
+      <w:r>
+        <w:rPr>
+          <w:color w:val="000000" w:themeColor="text1"/>
+        </w:rPr>
+        <w:t>,</w:t>
+      </w:r>
+    </w:p>
+    <w:p>
+      <w:pPr>
+        <w:rPr>
+          <w:color w:val="000000" w:themeColor="text1"/>
+        </w:rPr>
+      </w:pPr>
+      <w:r>
+        <w:rPr>
+          <w:color w:val="000000" w:themeColor="text1"/>
+        </w:rPr>
+        <w:t xml:space="preserve">    </w:t>
+      </w:r>
+      <w:proofErr w:type="spellStart"/>
+      <w:r>
+        <w:rPr>
+          <w:color w:val="000000" w:themeColor="text1"/>
+        </w:rPr>
+        <w:t>data_type</w:t>
+      </w:r>
+      <w:proofErr w:type="spellEnd"/>
+    </w:p>
+    <w:p>
+      <w:pPr>
+        <w:rPr>
+          <w:color w:val="000000" w:themeColor="text1"/>
+        </w:rPr>
+      </w:pPr>
+      <w:r>
+        <w:rPr>
+          <w:color w:val="000000" w:themeColor="text1"/>
+        </w:rPr>
+        <w:t xml:space="preserve">FROM </w:t>
+      </w:r>
+      <w:proofErr w:type="spellStart"/>
+      <w:r>
+        <w:rPr>
+          <w:color w:val="000000" w:themeColor="text1"/>
+        </w:rPr>
+        <w:t>information_</w:t>
+      </w:r>
+      <w:proofErr w:type="gramStart"/>
+      <w:r>
+        <w:rPr>
+          <w:color w:val="000000" w:themeColor="text1"/>
+        </w:rPr>
+        <w:t>schema.columns</w:t>
+      </w:r>
+      <w:proofErr w:type="spellEnd"/>
+      <w:proofErr w:type="gramEnd"/>
+    </w:p>
+    <w:p>
+      <w:pPr>
+        <w:rPr>
+          <w:color w:val="000000" w:themeColor="text1"/>
+        </w:rPr>
+      </w:pPr>
+      <w:r>
+        <w:rPr>
+          <w:color w:val="000000" w:themeColor="text1"/>
+        </w:rPr>
+        <w:t xml:space="preserve">WHERE </w:t>
+      </w:r>
+      <w:proofErr w:type="spellStart"/>
+      <w:r>
+        <w:rPr>
+          <w:color w:val="000000" w:themeColor="text1"/>
+        </w:rPr>
+        <w:t>table_schema</w:t>
+      </w:r>
+      <w:proofErr w:type="spellEnd"/>
+      <w:r>
+        <w:rPr>
+          <w:color w:val="000000" w:themeColor="text1"/>
+        </w:rPr>
+        <w:t xml:space="preserve"> = 'public'</w:t>
+      </w:r>
+    </w:p>
+    <w:p>
+      <w:pPr>
+        <w:rPr>
+          <w:color w:val="000000" w:themeColor="text1"/>
+        </w:rPr>
+      </w:pPr>
+      <w:r>
+        <w:rPr>
+          <w:color w:val="000000" w:themeColor="text1"/>
+        </w:rPr>
+        <w:t xml:space="preserve">  AND </w:t>
+      </w:r>
+      <w:proofErr w:type="spellStart"/>
+      <w:r>
+        <w:rPr>
+          <w:color w:val="000000" w:themeColor="text1"/>
+        </w:rPr>
+        <w:t>table_name</w:t>
+      </w:r>
+      <w:proofErr w:type="spellEnd"/>
+      <w:r>
+        <w:rPr>
+          <w:color w:val="000000" w:themeColor="text1"/>
+        </w:rPr>
+        <w:t xml:space="preserve"> = '</w:t>
+      </w:r>
+      <w:proofErr w:type="spellStart"/>
+      <w:r>
+        <w:rPr>
+          <w:color w:val="000000" w:themeColor="text1"/>
+        </w:rPr>
+        <w:t>trouble_tickets</w:t>
+      </w:r>
+      <w:proofErr w:type="spellEnd"/>
+      <w:r>
+        <w:rPr>
+          <w:color w:val="000000" w:themeColor="text1"/>
+        </w:rPr>
+        <w:t>'</w:t>
+      </w:r>
+    </w:p>
+    <w:p>
+      <w:pPr>
+        <w:rPr>
+          <w:color w:val="000000" w:themeColor="text1"/>
+        </w:rPr>
+      </w:pPr>
+      <w:r>
+        <w:rPr>
+          <w:color w:val="000000" w:themeColor="text1"/>
+        </w:rPr>
+        <w:t xml:space="preserve">ORDER BY </w:t>
+      </w:r>
+      <w:proofErr w:type="spellStart"/>
+      <w:r>
+        <w:rPr>
+          <w:color w:val="000000" w:themeColor="text1"/>
+        </w:rPr>
+        <w:t>ordinal_position</w:t>
+      </w:r>
+      <w:proofErr w:type="spellEnd"/>
+      <w:r>
+        <w:rPr>
+          <w:color w:val="000000" w:themeColor="text1"/>
+        </w:rPr>
+        <w:t>;</w:t>
+      </w:r>
+    </w:p>
+    <w:p>
+      <w:pPr>
+        <w:rPr>
+          <w:color w:val="000000" w:themeColor="text1"/>
+        </w:rPr>
+      </w:pPr>
+    </w:p>
+    <w:p>
+      <w:pPr>
+        <w:rPr>
+          <w:color w:val="000000" w:themeColor="text1"/>
+        </w:rPr>
+      </w:pPr>
+      <w:r>
+        <w:rPr>
+          <w:color w:val="000000" w:themeColor="text1"/>
+        </w:rPr>
+        <w:drawing>
+          <wp:inline distT="0" distB="0" distL="0" distR="0" wp14:anchorId="6813A508" wp14:editId="7EE83188">
+            <wp:extent cx="5943600" cy="3164205"/>
+            <wp:effectExtent l="0" t="0" r="0" b="0"/>
+            <wp:docPr id="2045387880" name="Picture 1"/>
+            <wp:cNvGraphicFramePr>
+              <a:graphicFrameLocks xmlns:a="http://schemas.openxmlformats.org/drawingml/2006/main" noChangeAspect="1"/>
+            </wp:cNvGraphicFramePr>
+            <a:graphic xmlns:a="http://schemas.openxmlformats.org/drawingml/2006/main">
+              <a:graphicData uri="http://schemas.openxmlformats.org/drawingml/2006/picture">
+                <pic:pic xmlns:pic="http://schemas.openxmlformats.org/drawingml/2006/picture">
+                  <pic:nvPicPr>
+                    <pic:cNvPr id="2045387880" name=""/>
+                    <pic:cNvPicPr/>
+                  </pic:nvPicPr>
+                  <pic:blipFill>
+                    <a:blip r:embed="rId9"/>
+                    <a:stretch>
+                      <a:fillRect/>
+                    </a:stretch>
+                  </pic:blipFill>
+                  <pic:spPr>
+                    <a:xfrm>
+                      <a:off x="0" y="0"/>
+                      <a:ext cx="5943600" cy="3164205"/>
+                    </a:xfrm>
+                    <a:prstGeom prst="rect">
+                      <a:avLst/>
+                    </a:prstGeom>
+                  </pic:spPr>
+                </pic:pic>
+              </a:graphicData>
+            </a:graphic>
+          </wp:inline>
+        </w:drawing>
+      </w:r>
+    </w:p>
+    <w:p>
+      <w:pPr>
+        <w:rPr>
+          <w:color w:val="000000" w:themeColor="text1"/>
+        </w:rPr>
+      </w:pPr>
+    </w:p>
+    <w:p>
+      <w:pPr>
+        <w:rPr>
+          <w:color w:val="000000" w:themeColor="text1"/>
+        </w:rPr>
+      </w:pPr>
+      <w:r>
+        <w:rPr>
+          <w:color w:val="000000" w:themeColor="text1"/>
+        </w:rPr>
+        <w:lastRenderedPageBreak/>
+        <w:drawing>
+          <wp:inline distT="0" distB="0" distL="0" distR="0" wp14:anchorId="60F71ECB" wp14:editId="289298E2">
+            <wp:extent cx="5943600" cy="3150235"/>
+            <wp:effectExtent l="0" t="0" r="0" b="0"/>
+            <wp:docPr id="1450684347" name="Picture 1"/>
+            <wp:cNvGraphicFramePr>
+              <a:graphicFrameLocks xmlns:a="http://schemas.openxmlformats.org/drawingml/2006/main" noChangeAspect="1"/>
+            </wp:cNvGraphicFramePr>
+            <a:graphic xmlns:a="http://schemas.openxmlformats.org/drawingml/2006/main">
+              <a:graphicData uri="http://schemas.openxmlformats.org/drawingml/2006/picture">
+                <pic:pic xmlns:pic="http://schemas.openxmlformats.org/drawingml/2006/picture">
+                  <pic:nvPicPr>
+                    <pic:cNvPr id="1450684347" name=""/>
+                    <pic:cNvPicPr/>
+                  </pic:nvPicPr>
+                  <pic:blipFill>
+                    <a:blip r:embed="rId10"/>
+                    <a:stretch>
+                      <a:fillRect/>
+                    </a:stretch>
+                  </pic:blipFill>
+                  <pic:spPr>
+                    <a:xfrm>
+                      <a:off x="0" y="0"/>
+                      <a:ext cx="5943600" cy="3150235"/>
+                    </a:xfrm>
+                    <a:prstGeom prst="rect">
+                      <a:avLst/>
+                    </a:prstGeom>
+                  </pic:spPr>
+                </pic:pic>
+              </a:graphicData>
+            </a:graphic>
+          </wp:inline>
+        </w:drawing>
+      </w:r>
+    </w:p>
+    <w:p>
+      <w:pPr>
+        <w:rPr>
+          <w:color w:val="000000" w:themeColor="text1"/>
+        </w:rPr>
+      </w:pPr>
+    </w:p>
+    <w:p>
+      <w:pPr>
+        <w:rPr>
+          <w:color w:val="000000" w:themeColor="text1"/>
+        </w:rPr>
+      </w:pPr>
+    </w:p>
+    <w:p>
+      <w:pPr>
+        <w:rPr>
+          <w:color w:val="000000" w:themeColor="text1"/>
+        </w:rPr>
+      </w:pPr>
+    </w:p>
+    <w:p>
+      <w:pPr>
+        <w:rPr>
+          <w:color w:val="000000" w:themeColor="text1"/>
+        </w:rPr>
+      </w:pPr>
+    </w:p>
+    <w:p>
+      <w:pPr>
+        <w:rPr>
+          <w:color w:val="000000" w:themeColor="text1"/>
+        </w:rPr>
+      </w:pPr>
+    </w:p>
+    <w:p>
+      <w:pPr>
+        <w:rPr>
+          <w:color w:val="000000" w:themeColor="text1"/>
+        </w:rPr>
+      </w:pPr>
+    </w:p>
+    <w:p>
+      <w:pPr>
+        <w:rPr>
+          <w:color w:val="000000" w:themeColor="text1"/>
+        </w:rPr>
+      </w:pPr>
+    </w:p>
+    <w:p>
+      <w:pPr>
+        <w:rPr>
+          <w:color w:val="000000" w:themeColor="text1"/>
+        </w:rPr>
+      </w:pPr>
+    </w:p>
+    <w:p>
+      <w:pPr>
+        <w:rPr>
+          <w:color w:val="000000" w:themeColor="text1"/>
+        </w:rPr>
+      </w:pPr>
+    </w:p>
+    <w:p>
+      <w:pPr>
+        <w:rPr>
+          <w:color w:val="000000" w:themeColor="text1"/>
+        </w:rPr>
+      </w:pPr>
+    </w:p>
+    <w:p>
+      <w:pPr>
+        <w:rPr>
+          <w:color w:val="000000" w:themeColor="text1"/>
+        </w:rPr>
+      </w:pPr>
+    </w:p>
+    <w:p>
+      <w:pPr>
+        <w:rPr>
+          <w:color w:val="000000" w:themeColor="text1"/>
+        </w:rPr>
+      </w:pPr>
+    </w:p>
+    <w:p>
+      <w:pPr>
+        <w:rPr>
+          <w:color w:val="000000" w:themeColor="text1"/>
+        </w:rPr>
+      </w:pPr>
+    </w:p>
+    <w:p>
+      <w:pPr>
+        <w:rPr>
+          <w:color w:val="000000" w:themeColor="text1"/>
+        </w:rPr>
+      </w:pPr>
+    </w:p>
+    <w:p>
+      <w:pPr>
+        <w:rPr>
+          <w:color w:val="000000" w:themeColor="text1"/>
+        </w:rPr>
+      </w:pPr>
+    </w:p>
+    <w:p>
+      <w:pPr>
+        <w:rPr>
+          <w:color w:val="000000" w:themeColor="text1"/>
+        </w:rPr>
+      </w:pPr>
+    </w:p>
+    <w:p>
+      <w:pPr>
+        <w:rPr>
+          <w:color w:val="000000" w:themeColor="text1"/>
+        </w:rPr>
+      </w:pPr>
+      <w:r>
+        <w:rPr>
+          <w:color w:val="000000" w:themeColor="text1"/>
+        </w:rPr>
+        <w:lastRenderedPageBreak/>
+        <w:t>SELECT</w:t>
+      </w:r>
+    </w:p>
+    <w:p>
+      <w:pPr>
+        <w:rPr>
+          <w:color w:val="000000" w:themeColor="text1"/>
+        </w:rPr>
+      </w:pPr>
+      <w:r>
+        <w:rPr>
+          <w:color w:val="000000" w:themeColor="text1"/>
+        </w:rPr>
+        <w:t xml:space="preserve">    </w:t>
+      </w:r>
+      <w:proofErr w:type="spellStart"/>
+      <w:r>
+        <w:rPr>
+          <w:color w:val="000000" w:themeColor="text1"/>
+        </w:rPr>
+        <w:t>ordinal_position</w:t>
+      </w:r>
+      <w:proofErr w:type="spellEnd"/>
+      <w:r>
+        <w:rPr>
+          <w:color w:val="000000" w:themeColor="text1"/>
+        </w:rPr>
+        <w:t>,</w:t>
+      </w:r>
+    </w:p>
+    <w:p>
+      <w:pPr>
+        <w:rPr>
+          <w:color w:val="000000" w:themeColor="text1"/>
+        </w:rPr>
+      </w:pPr>
+      <w:r>
+        <w:rPr>
+          <w:color w:val="000000" w:themeColor="text1"/>
+        </w:rPr>
+        <w:t xml:space="preserve">    </w:t>
+      </w:r>
+      <w:proofErr w:type="spellStart"/>
+      <w:r>
+        <w:rPr>
+          <w:color w:val="000000" w:themeColor="text1"/>
+        </w:rPr>
+        <w:t>column_name</w:t>
+      </w:r>
+      <w:proofErr w:type="spellEnd"/>
+      <w:r>
+        <w:rPr>
+          <w:color w:val="000000" w:themeColor="text1"/>
+        </w:rPr>
+        <w:t>,</w:t>
+      </w:r>
+    </w:p>
+    <w:p>
+      <w:pPr>
+        <w:rPr>
+          <w:color w:val="000000" w:themeColor="text1"/>
+        </w:rPr>
+      </w:pPr>
+      <w:r>
+        <w:rPr>
+          <w:color w:val="000000" w:themeColor="text1"/>
+        </w:rPr>
+        <w:t xml:space="preserve">    </w:t>
+      </w:r>
+      <w:proofErr w:type="spellStart"/>
+      <w:r>
+        <w:rPr>
+          <w:color w:val="000000" w:themeColor="text1"/>
+        </w:rPr>
+        <w:t>data_type</w:t>
+      </w:r>
+      <w:proofErr w:type="spellEnd"/>
+      <w:r>
+        <w:rPr>
+          <w:color w:val="000000" w:themeColor="text1"/>
+        </w:rPr>
+        <w:t>,</w:t>
+      </w:r>
+    </w:p>
+    <w:p>
+      <w:pPr>
+        <w:rPr>
+          <w:color w:val="000000" w:themeColor="text1"/>
+        </w:rPr>
+      </w:pPr>
+      <w:r>
+        <w:rPr>
+          <w:color w:val="000000" w:themeColor="text1"/>
+        </w:rPr>
+        <w:t xml:space="preserve">    </w:t>
+      </w:r>
+      <w:proofErr w:type="spellStart"/>
+      <w:r>
+        <w:rPr>
+          <w:color w:val="000000" w:themeColor="text1"/>
+        </w:rPr>
+        <w:t>is_nullable</w:t>
+      </w:r>
+      <w:proofErr w:type="spellEnd"/>
+    </w:p>
+    <w:p>
+      <w:pPr>
+        <w:rPr>
+          <w:color w:val="000000" w:themeColor="text1"/>
+        </w:rPr>
+      </w:pPr>
+      <w:r>
+        <w:rPr>
+          <w:color w:val="000000" w:themeColor="text1"/>
+        </w:rPr>
+        <w:t xml:space="preserve">FROM </w:t>
+      </w:r>
+      <w:proofErr w:type="spellStart"/>
+      <w:r>
+        <w:rPr>
+          <w:color w:val="000000" w:themeColor="text1"/>
+        </w:rPr>
+        <w:t>information_</w:t>
+      </w:r>
+      <w:proofErr w:type="gramStart"/>
+      <w:r>
+        <w:rPr>
+          <w:color w:val="000000" w:themeColor="text1"/>
+        </w:rPr>
+        <w:t>schema.columns</w:t>
+      </w:r>
+      <w:proofErr w:type="spellEnd"/>
+      <w:proofErr w:type="gramEnd"/>
+    </w:p>
+    <w:p>
+      <w:pPr>
+        <w:rPr>
+          <w:color w:val="000000" w:themeColor="text1"/>
+        </w:rPr>
+      </w:pPr>
+      <w:r>
+        <w:rPr>
+          <w:color w:val="000000" w:themeColor="text1"/>
+        </w:rPr>
+        <w:t xml:space="preserve">WHERE </w:t>
+      </w:r>
+      <w:proofErr w:type="spellStart"/>
+      <w:r>
+        <w:rPr>
+          <w:color w:val="000000" w:themeColor="text1"/>
+        </w:rPr>
+        <w:t>table_schema</w:t>
+      </w:r>
+      <w:proofErr w:type="spellEnd"/>
+      <w:r>
+        <w:rPr>
+          <w:color w:val="000000" w:themeColor="text1"/>
+        </w:rPr>
+        <w:t xml:space="preserve"> = 'public'</w:t>
+      </w:r>
+    </w:p>
+    <w:p>
+      <w:pPr>
+        <w:rPr>
+          <w:color w:val="000000" w:themeColor="text1"/>
+        </w:rPr>
+      </w:pPr>
+      <w:r>
+        <w:rPr>
+          <w:color w:val="000000" w:themeColor="text1"/>
+        </w:rPr>
+        <w:t xml:space="preserve">  AND </w:t>
+      </w:r>
+      <w:proofErr w:type="spellStart"/>
+      <w:r>
+        <w:rPr>
+          <w:color w:val="000000" w:themeColor="text1"/>
+        </w:rPr>
+        <w:t>table_name</w:t>
+      </w:r>
+      <w:proofErr w:type="spellEnd"/>
+      <w:r>
+        <w:rPr>
+          <w:color w:val="000000" w:themeColor="text1"/>
+        </w:rPr>
+        <w:t xml:space="preserve"> = '</w:t>
+      </w:r>
+      <w:proofErr w:type="spellStart"/>
+      <w:r>
+        <w:rPr>
+          <w:color w:val="000000" w:themeColor="text1"/>
+        </w:rPr>
+        <w:t>tt_faults</w:t>
+      </w:r>
+      <w:proofErr w:type="spellEnd"/>
+      <w:r>
+        <w:rPr>
+          <w:color w:val="000000" w:themeColor="text1"/>
+        </w:rPr>
+        <w:t>'</w:t>
+      </w:r>
+    </w:p>
+    <w:p>
+      <w:pPr>
+        <w:rPr>
+          <w:color w:val="000000" w:themeColor="text1"/>
+        </w:rPr>
+      </w:pPr>
+      <w:r>
+        <w:rPr>
+          <w:color w:val="000000" w:themeColor="text1"/>
+        </w:rPr>
+        <w:t xml:space="preserve">ORDER BY </w:t>
+      </w:r>
+      <w:proofErr w:type="spellStart"/>
+      <w:r>
+        <w:rPr>
+          <w:color w:val="000000" w:themeColor="text1"/>
+        </w:rPr>
+        <w:t>ordinal_position</w:t>
+      </w:r>
+      <w:proofErr w:type="spellEnd"/>
+      <w:r>
+        <w:rPr>
+          <w:color w:val="000000" w:themeColor="text1"/>
+        </w:rPr>
+        <w:t>;</w:t>
+      </w:r>
+    </w:p>
+    <w:p>
+      <w:pPr>
+        <w:rPr>
+          <w:color w:val="000000" w:themeColor="text1"/>
+        </w:rPr>
+      </w:pPr>
+    </w:p>
+    <w:p>
+      <w:pPr>
+        <w:rPr>
+          <w:color w:val="000000" w:themeColor="text1"/>
+        </w:rPr>
+      </w:pPr>
+    </w:p>
+    <w:p>
+      <w:pPr>
+        <w:rPr>
+          <w:color w:val="000000" w:themeColor="text1"/>
+        </w:rPr>
+      </w:pPr>
+      <w:r>
+        <w:rPr>
+          <w:color w:val="000000" w:themeColor="text1"/>
+        </w:rPr>
+        <w:drawing>
+          <wp:inline distT="0" distB="0" distL="0" distR="0" wp14:anchorId="79431ED8" wp14:editId="356312A2">
+            <wp:extent cx="5943600" cy="3181350"/>
+            <wp:effectExtent l="0" t="0" r="0" b="0"/>
+            <wp:docPr id="344807316" name="Picture 1"/>
+            <wp:cNvGraphicFramePr>
+              <a:graphicFrameLocks xmlns:a="http://schemas.openxmlformats.org/drawingml/2006/main" noChangeAspect="1"/>
+            </wp:cNvGraphicFramePr>
+            <a:graphic xmlns:a="http://schemas.openxmlformats.org/drawingml/2006/main">
+              <a:graphicData uri="http://schemas.openxmlformats.org/drawingml/2006/picture">
+                <pic:pic xmlns:pic="http://schemas.openxmlformats.org/drawingml/2006/picture">
+                  <pic:nvPicPr>
+                    <pic:cNvPr id="344807316" name=""/>
+                    <pic:cNvPicPr/>
+                  </pic:nvPicPr>
+                  <pic:blipFill>
+                    <a:blip r:embed="rId11"/>
+                    <a:stretch>
+                      <a:fillRect/>
+                    </a:stretch>
+                  </pic:blipFill>
+                  <pic:spPr>
+                    <a:xfrm>
+                      <a:off x="0" y="0"/>
+                      <a:ext cx="5943600" cy="3181350"/>
+                    </a:xfrm>
+                    <a:prstGeom prst="rect">
+                      <a:avLst/>
+                    </a:prstGeom>
+                  </pic:spPr>
+                </pic:pic>
+              </a:graphicData>
+            </a:graphic>
+          </wp:inline>
+        </w:drawing>
+      </w:r>
+    </w:p>
+    <w:p>
+      <w:pPr>
+        <w:rPr>
+          <w:color w:val="000000" w:themeColor="text1"/>
+        </w:rPr>
+      </w:pPr>
+    </w:p>
+    <w:p>
+      <w:pPr>
+        <w:rPr>
+          <w:color w:val="000000" w:themeColor="text1"/>
+        </w:rPr>
+      </w:pPr>
+    </w:p>
+    <w:p>
+      <w:pPr>
+        <w:rPr>
+          <w:color w:val="000000" w:themeColor="text1"/>
+        </w:rPr>
+      </w:pPr>
+    </w:p>
+    <w:p>
+      <w:pPr>
+        <w:rPr>
+          <w:color w:val="000000" w:themeColor="text1"/>
+        </w:rPr>
+      </w:pPr>
+    </w:p>
+    <w:p>
+      <w:pPr>
+        <w:rPr>
+          <w:color w:val="000000" w:themeColor="text1"/>
+        </w:rPr>
+      </w:pPr>
+    </w:p>
+    <w:p>
+      <w:pPr>
+        <w:rPr>
+          <w:color w:val="000000" w:themeColor="text1"/>
+        </w:rPr>
+      </w:pPr>
+    </w:p>
+    <w:p>
+      <w:pPr>
+        <w:rPr>
+          <w:b/>
+          <w:bCs/>
+          <w:color w:val="000000" w:themeColor="text1"/>
+        </w:rPr>
+      </w:pPr>
+      <w:r>
+        <w:rPr>
+          <w:b/>
+          <w:bCs/>
+          <w:color w:val="000000" w:themeColor="text1"/>
+        </w:rPr>
+        <w:t>New request flow</w:t>
+      </w:r>
+    </w:p>
+    <w:p>
+      <w:pPr>
+        <w:rPr>
+          <w:color w:val="000000" w:themeColor="text1"/>
+        </w:rPr>
+      </w:pPr>
+      <w:r>
+        <w:rPr>
+          <w:color w:val="000000" w:themeColor="text1"/>
+        </w:rPr>
+        <w:t>The page now does:</w:t>
+      </w:r>
+    </w:p>
+    <w:p>
+      <w:pPr>
+        <w:rPr>
+          <w:color w:val="000000" w:themeColor="text1"/>
+        </w:rPr>
+      </w:pPr>
+      <w:r>
+        <w:rPr>
+          <w:color w:val="000000" w:themeColor="text1"/>
+        </w:rPr>
+        <w:t>Create TT page</w:t>
+      </w:r>
+    </w:p>
+    <w:p>
+      <w:pPr>
+        <w:rPr>
+          <w:color w:val="000000" w:themeColor="text1"/>
+        </w:rPr>
+      </w:pPr>
+      <w:r>
+        <w:rPr>
+          <w:color w:val="000000" w:themeColor="text1"/>
+        </w:rPr>
+        <w:t xml:space="preserve">      ↓</w:t>
+      </w:r>
+    </w:p>
+    <w:p>
+      <w:pPr>
+        <w:rPr>
+          <w:color w:val="000000" w:themeColor="text1"/>
+        </w:rPr>
+      </w:pPr>
+      <w:r>
+        <w:rPr>
+          <w:color w:val="000000" w:themeColor="text1"/>
+        </w:rPr>
+        <w:t>Select Fault Type</w:t>
+      </w:r>
+    </w:p>
+    <w:p>
+      <w:pPr>
+        <w:rPr>
+          <w:color w:val="000000" w:themeColor="text1"/>
+        </w:rPr>
+      </w:pPr>
+      <w:r>
+        <w:rPr>
+          <w:color w:val="000000" w:themeColor="text1"/>
+        </w:rPr>
+        <w:t xml:space="preserve">      ↓</w:t>
+      </w:r>
+    </w:p>
+    <w:p>
+      <w:pPr>
+        <w:rPr>
+          <w:color w:val="000000" w:themeColor="text1"/>
+        </w:rPr>
+      </w:pPr>
+      <w:r>
+        <w:rPr>
+          <w:color w:val="000000" w:themeColor="text1"/>
+        </w:rPr>
+        <w:t>Enter Description</w:t>
+      </w:r>
+    </w:p>
+    <w:p>
+      <w:pPr>
+        <w:rPr>
+          <w:color w:val="000000" w:themeColor="text1"/>
+        </w:rPr>
+      </w:pPr>
+      <w:r>
+        <w:rPr>
+          <w:color w:val="000000" w:themeColor="text1"/>
+        </w:rPr>
+        <w:t xml:space="preserve">      ↓</w:t>
+      </w:r>
+    </w:p>
+    <w:p>
+      <w:pPr>
+        <w:rPr>
+          <w:color w:val="000000" w:themeColor="text1"/>
+        </w:rPr>
+      </w:pPr>
+      <w:r>
+        <w:rPr>
+          <w:color w:val="000000" w:themeColor="text1"/>
+        </w:rPr>
+        <w:t>Add another TT</w:t>
+      </w:r>
+    </w:p>
+    <w:p>
+      <w:pPr>
+        <w:rPr>
+          <w:color w:val="000000" w:themeColor="text1"/>
+        </w:rPr>
+      </w:pPr>
+      <w:r>
+        <w:rPr>
+          <w:color w:val="000000" w:themeColor="text1"/>
+        </w:rPr>
+        <w:t xml:space="preserve">      ↓</w:t>
+      </w:r>
+    </w:p>
+    <w:p>
+      <w:pPr>
+        <w:rPr>
+          <w:color w:val="000000" w:themeColor="text1"/>
+        </w:rPr>
+      </w:pPr>
+      <w:r>
+        <w:rPr>
+          <w:color w:val="000000" w:themeColor="text1"/>
+        </w:rPr>
+        <w:t>Add up to 10</w:t>
+      </w:r>
+    </w:p>
+    <w:p>
+      <w:pPr>
+        <w:rPr>
+          <w:color w:val="000000" w:themeColor="text1"/>
+        </w:rPr>
+      </w:pPr>
+      <w:r>
+        <w:rPr>
+          <w:color w:val="000000" w:themeColor="text1"/>
+        </w:rPr>
+        <w:t xml:space="preserve">      ↓</w:t>
+      </w:r>
+    </w:p>
+    <w:p>
+      <w:pPr>
+        <w:rPr>
+          <w:color w:val="000000" w:themeColor="text1"/>
+        </w:rPr>
+      </w:pPr>
+      <w:r>
+        <w:rPr>
+          <w:color w:val="000000" w:themeColor="text1"/>
+        </w:rPr>
+        <w:t>Submit</w:t>
+      </w:r>
+    </w:p>
+    <w:p>
+      <w:pPr>
+        <w:rPr>
+          <w:color w:val="000000" w:themeColor="text1"/>
+        </w:rPr>
+      </w:pPr>
+      <w:r>
+        <w:rPr>
+          <w:color w:val="000000" w:themeColor="text1"/>
+        </w:rPr>
+        <w:t xml:space="preserve">      ↓</w:t>
+      </w:r>
+    </w:p>
+    <w:p>
+      <w:pPr>
+        <w:rPr>
+          <w:color w:val="000000" w:themeColor="text1"/>
+        </w:rPr>
+      </w:pPr>
+      <w:r>
+        <w:rPr>
+          <w:color w:val="000000" w:themeColor="text1"/>
+        </w:rPr>
+        <w:t>POST /</w:t>
+      </w:r>
+      <w:proofErr w:type="spellStart"/>
+      <w:r>
+        <w:rPr>
+          <w:color w:val="000000" w:themeColor="text1"/>
+        </w:rPr>
+        <w:t>api</w:t>
+      </w:r>
+      <w:proofErr w:type="spellEnd"/>
+      <w:r>
+        <w:rPr>
+          <w:color w:val="000000" w:themeColor="text1"/>
+        </w:rPr>
+        <w:t>/v1/tickets/bulk</w:t>
+      </w:r>
+    </w:p>
+    <w:p>
+      <w:pPr>
+        <w:rPr>
+          <w:color w:val="000000" w:themeColor="text1"/>
+        </w:rPr>
+      </w:pPr>
+      <w:r>
+        <w:rPr>
+          <w:color w:val="000000" w:themeColor="text1"/>
+        </w:rPr>
+        <w:t xml:space="preserve">      ↓</w:t>
+      </w:r>
+    </w:p>
+    <w:p>
+      <w:pPr>
+        <w:rPr>
+          <w:color w:val="000000" w:themeColor="text1"/>
+        </w:rPr>
+      </w:pPr>
+      <w:r>
+        <w:rPr>
+          <w:color w:val="000000" w:themeColor="text1"/>
+        </w:rPr>
+        <w:t>Backend validates ALL tickets</w:t>
+      </w:r>
+    </w:p>
+    <w:p>
+      <w:pPr>
+        <w:rPr>
+          <w:color w:val="000000" w:themeColor="text1"/>
+        </w:rPr>
+      </w:pPr>
+      <w:r>
+        <w:rPr>
+          <w:color w:val="000000" w:themeColor="text1"/>
+        </w:rPr>
+        <w:t xml:space="preserve">      ↓</w:t>
+      </w:r>
+    </w:p>
+    <w:p>
+      <w:pPr>
+        <w:rPr>
+          <w:color w:val="000000" w:themeColor="text1"/>
+        </w:rPr>
+      </w:pPr>
+      <w:r>
+        <w:rPr>
+          <w:color w:val="000000" w:themeColor="text1"/>
+        </w:rPr>
+        <w:t>BEGIN TRANSACTION</w:t>
+      </w:r>
+    </w:p>
+    <w:p>
+      <w:pPr>
+        <w:rPr>
+          <w:color w:val="000000" w:themeColor="text1"/>
+        </w:rPr>
+      </w:pPr>
+      <w:r>
+        <w:rPr>
+          <w:color w:val="000000" w:themeColor="text1"/>
+        </w:rPr>
+        <w:t xml:space="preserve">      ↓</w:t>
+      </w:r>
+    </w:p>
+    <w:p>
+      <w:pPr>
+        <w:rPr>
+          <w:color w:val="000000" w:themeColor="text1"/>
+        </w:rPr>
+      </w:pPr>
+      <w:r>
+        <w:rPr>
+          <w:color w:val="000000" w:themeColor="text1"/>
+        </w:rPr>
+        <w:t>Generate TT numbers</w:t>
+      </w:r>
+    </w:p>
+    <w:p>
+      <w:pPr>
+        <w:rPr>
+          <w:color w:val="000000" w:themeColor="text1"/>
+        </w:rPr>
+      </w:pPr>
+      <w:r>
+        <w:rPr>
+          <w:color w:val="000000" w:themeColor="text1"/>
+        </w:rPr>
+        <w:t xml:space="preserve">      ↓</w:t>
+      </w:r>
+    </w:p>
+    <w:p>
+      <w:pPr>
+        <w:rPr>
+          <w:color w:val="000000" w:themeColor="text1"/>
+        </w:rPr>
+      </w:pPr>
+      <w:r>
+        <w:rPr>
+          <w:color w:val="000000" w:themeColor="text1"/>
+        </w:rPr>
+        <w:t xml:space="preserve">Insert </w:t>
+      </w:r>
+      <w:proofErr w:type="spellStart"/>
+      <w:r>
+        <w:rPr>
+          <w:color w:val="000000" w:themeColor="text1"/>
+        </w:rPr>
+        <w:t>trouble_tickets</w:t>
+      </w:r>
+      <w:proofErr w:type="spellEnd"/>
+    </w:p>
+    <w:p>
+      <w:pPr>
+        <w:rPr>
+          <w:color w:val="000000" w:themeColor="text1"/>
+        </w:rPr>
+      </w:pPr>
+      <w:r>
+        <w:rPr>
+          <w:color w:val="000000" w:themeColor="text1"/>
+        </w:rPr>
+        <w:t xml:space="preserve">      ↓</w:t>
+      </w:r>
+    </w:p>
+    <w:p>
+      <w:pPr>
+        <w:rPr>
+          <w:color w:val="000000" w:themeColor="text1"/>
+        </w:rPr>
+      </w:pPr>
+      <w:r>
+        <w:rPr>
+          <w:color w:val="000000" w:themeColor="text1"/>
+        </w:rPr>
+        <w:lastRenderedPageBreak/>
+        <w:t xml:space="preserve">Insert </w:t>
+      </w:r>
+      <w:proofErr w:type="spellStart"/>
+      <w:r>
+        <w:rPr>
+          <w:color w:val="000000" w:themeColor="text1"/>
+        </w:rPr>
+        <w:t>trouble_ticket_history</w:t>
+      </w:r>
+      <w:proofErr w:type="spellEnd"/>
+    </w:p>
+    <w:p>
+      <w:pPr>
+        <w:rPr>
+          <w:color w:val="000000" w:themeColor="text1"/>
+        </w:rPr>
+      </w:pPr>
+      <w:r>
+        <w:rPr>
+          <w:color w:val="000000" w:themeColor="text1"/>
+        </w:rPr>
+        <w:t xml:space="preserve">      ↓</w:t>
+      </w:r>
+    </w:p>
+    <w:p>
+      <w:pPr>
+        <w:rPr>
+          <w:color w:val="000000" w:themeColor="text1"/>
+        </w:rPr>
+      </w:pPr>
+      <w:r>
+        <w:rPr>
+          <w:color w:val="000000" w:themeColor="text1"/>
+        </w:rPr>
+        <w:t>COMMIT</w:t>
+      </w:r>
+    </w:p>
+    <w:p>
+      <w:pPr>
+        <w:rPr>
+          <w:color w:val="000000" w:themeColor="text1"/>
+        </w:rPr>
+      </w:pPr>
+      <w:r>
+        <w:rPr>
+          <w:color w:val="000000" w:themeColor="text1"/>
+        </w:rPr>
+        <w:t xml:space="preserve">      ↓</w:t>
+      </w:r>
+    </w:p>
+    <w:p>
+      <w:pPr>
+        <w:rPr>
+          <w:color w:val="000000" w:themeColor="text1"/>
+        </w:rPr>
+      </w:pPr>
+      <w:r>
+        <w:rPr>
+          <w:color w:val="000000" w:themeColor="text1"/>
+        </w:rPr>
+        <w:t>Return all TT numbers</w:t>
+      </w:r>
+    </w:p>
+    <w:p>
+      <w:pPr>
+        <w:rPr>
+          <w:color w:val="000000" w:themeColor="text1"/>
+        </w:rPr>
+      </w:pPr>
+    </w:p>
+    <w:p>
+      <w:pPr>
+        <w:rPr>
+          <w:color w:val="000000" w:themeColor="text1"/>
+        </w:rPr>
+      </w:pPr>
+    </w:p>
+    <w:p>
+      <w:pPr>
+        <w:rPr>
+          <w:color w:val="000000" w:themeColor="text1"/>
+        </w:rPr>
+      </w:pPr>
+      <w:hyperlink r:id="rId12" w:history="1">
+        <w:r>
+          <w:rPr>
+            <w:rStyle w:val="Hyperlink"/>
+          </w:rPr>
+          <w:t>http://localhost:5173/dashboard/operations/create_tt</w:t>
+        </w:r>
+      </w:hyperlink>
+    </w:p>
+    <w:p>
+      <w:pPr>
+        <w:rPr>
+          <w:color w:val="000000" w:themeColor="text1"/>
+        </w:rPr>
+      </w:pPr>
+    </w:p>
+    <w:p>
+      <w:pPr>
+        <w:rPr>
+          <w:color w:val="000000" w:themeColor="text1"/>
+        </w:rPr>
+      </w:pPr>
+      <w:r>
+        <w:rPr>
+          <w:color w:val="000000" w:themeColor="text1"/>
+        </w:rPr>
+        <w:drawing>
+          <wp:inline distT="0" distB="0" distL="0" distR="0" wp14:anchorId="44827C0B" wp14:editId="48CFBFAC">
+            <wp:extent cx="5943600" cy="3038475"/>
+            <wp:effectExtent l="0" t="0" r="0" b="9525"/>
+            <wp:docPr id="505634492" name="Picture 1"/>
+            <wp:cNvGraphicFramePr>
+              <a:graphicFrameLocks xmlns:a="http://schemas.openxmlformats.org/drawingml/2006/main" noChangeAspect="1"/>
+            </wp:cNvGraphicFramePr>
+            <a:graphic xmlns:a="http://schemas.openxmlformats.org/drawingml/2006/main">
+              <a:graphicData uri="http://schemas.openxmlformats.org/drawingml/2006/picture">
+                <pic:pic xmlns:pic="http://schemas.openxmlformats.org/drawingml/2006/picture">
+                  <pic:nvPicPr>
+                    <pic:cNvPr id="505634492" name=""/>
+                    <pic:cNvPicPr/>
+                  </pic:nvPicPr>
+                  <pic:blipFill>
+                    <a:blip r:embed="rId13"/>
+                    <a:stretch>
+                      <a:fillRect/>
+                    </a:stretch>
+                  </pic:blipFill>
+                  <pic:spPr>
+                    <a:xfrm>
+                      <a:off x="0" y="0"/>
+                      <a:ext cx="5943600" cy="3038475"/>
+                    </a:xfrm>
+                    <a:prstGeom prst="rect">
+                      <a:avLst/>
+                    </a:prstGeom>
+                  </pic:spPr>
+                </pic:pic>
+              </a:graphicData>
+            </a:graphic>
+          </wp:inline>
+        </w:drawing>
+      </w:r>
+    </w:p>
+    <w:p>
+      <w:pPr>
+        <w:rPr>
+          <w:color w:val="000000" w:themeColor="text1"/>
+        </w:rPr>
+      </w:pPr>
+    </w:p>
+    <w:p>
+      <w:pPr>
+        <w:rPr>
+          <w:color w:val="000000" w:themeColor="text1"/>
+        </w:rPr>
+      </w:pPr>
+      <w:r>
+        <w:rPr>
+          <w:color w:val="000000" w:themeColor="text1"/>
+        </w:rPr>
+        <w:lastRenderedPageBreak/>
+        <w:drawing>
+          <wp:inline distT="0" distB="0" distL="0" distR="0" wp14:anchorId="0B8ED1D1" wp14:editId="6372DB4D">
+            <wp:extent cx="5943600" cy="3162300"/>
+            <wp:effectExtent l="0" t="0" r="0" b="0"/>
+            <wp:docPr id="1930764988" name="Picture 1"/>
+            <wp:cNvGraphicFramePr>
+              <a:graphicFrameLocks xmlns:a="http://schemas.openxmlformats.org/drawingml/2006/main" noChangeAspect="1"/>
+            </wp:cNvGraphicFramePr>
+            <a:graphic xmlns:a="http://schemas.openxmlformats.org/drawingml/2006/main">
+              <a:graphicData uri="http://schemas.openxmlformats.org/drawingml/2006/picture">
+                <pic:pic xmlns:pic="http://schemas.openxmlformats.org/drawingml/2006/picture">
+                  <pic:nvPicPr>
+                    <pic:cNvPr id="1930764988" name=""/>
+                    <pic:cNvPicPr/>
+                  </pic:nvPicPr>
+                  <pic:blipFill>
+                    <a:blip r:embed="rId14"/>
+                    <a:stretch>
+                      <a:fillRect/>
+                    </a:stretch>
+                  </pic:blipFill>
+                  <pic:spPr>
+                    <a:xfrm>
+                      <a:off x="0" y="0"/>
+                      <a:ext cx="5943600" cy="3162300"/>
+                    </a:xfrm>
+                    <a:prstGeom prst="rect">
+                      <a:avLst/>
+                    </a:prstGeom>
+                  </pic:spPr>
+                </pic:pic>
+              </a:graphicData>
+            </a:graphic>
+          </wp:inline>
+        </w:drawing>
+      </w:r>
+    </w:p>
+    <w:p>
+      <w:pPr>
+        <w:rPr>
+          <w:color w:val="000000" w:themeColor="text1"/>
         </w:rPr>
       </w:pPr>
     </w:p>

</xml_diff>